<commit_message>
Fix: botones de UI, redireccion de examen y barra de progreso dinamica
</commit_message>
<xml_diff>
--- a/proyecto campus virtual.docx
+++ b/proyecto campus virtual.docx
@@ -2296,7 +2296,7 @@
           <w:szCs w:val="22"/>
         </w:rPr>
         <w:pict w14:anchorId="0C6C96C3">
-          <v:rect id="_x0000_i1109" style="width:0;height:1.5pt" o:hralign="center" o:hrstd="t" o:hr="t" fillcolor="#a0a0a0" stroked="f"/>
+          <v:rect id="_x0000_i1025" style="width:0;height:1.5pt" o:hralign="center" o:hrstd="t" o:hr="t" fillcolor="#a0a0a0" stroked="f"/>
         </w:pict>
       </w:r>
     </w:p>
@@ -2708,7 +2708,7 @@
           <w:szCs w:val="22"/>
         </w:rPr>
         <w:pict w14:anchorId="3CE078A1">
-          <v:rect id="_x0000_i1110" style="width:0;height:1.5pt" o:hralign="center" o:hrstd="t" o:hr="t" fillcolor="#a0a0a0" stroked="f"/>
+          <v:rect id="_x0000_i1026" style="width:0;height:1.5pt" o:hralign="center" o:hrstd="t" o:hr="t" fillcolor="#a0a0a0" stroked="f"/>
         </w:pict>
       </w:r>
     </w:p>
@@ -4289,7 +4289,7 @@
           <w:szCs w:val="22"/>
         </w:rPr>
         <w:pict w14:anchorId="0A807E66">
-          <v:rect id="_x0000_i1111" style="width:0;height:1.5pt" o:hralign="center" o:hrstd="t" o:hr="t" fillcolor="#a0a0a0" stroked="f"/>
+          <v:rect id="_x0000_i1027" style="width:0;height:1.5pt" o:hralign="center" o:hrstd="t" o:hr="t" fillcolor="#a0a0a0" stroked="f"/>
         </w:pict>
       </w:r>
     </w:p>
@@ -4666,7 +4666,7 @@
           <w:szCs w:val="22"/>
         </w:rPr>
         <w:pict w14:anchorId="7E7DD496">
-          <v:rect id="_x0000_i1112" style="width:0;height:1.5pt" o:hralign="center" o:hrstd="t" o:hr="t" fillcolor="#a0a0a0" stroked="f"/>
+          <v:rect id="_x0000_i1028" style="width:0;height:1.5pt" o:hralign="center" o:hrstd="t" o:hr="t" fillcolor="#a0a0a0" stroked="f"/>
         </w:pict>
       </w:r>
     </w:p>
@@ -5457,7 +5457,7 @@
           <w:szCs w:val="22"/>
         </w:rPr>
         <w:pict w14:anchorId="3C516DE9">
-          <v:rect id="_x0000_i1113" style="width:0;height:1.5pt" o:hralign="center" o:hrstd="t" o:hr="t" fillcolor="#a0a0a0" stroked="f"/>
+          <v:rect id="_x0000_i1029" style="width:0;height:1.5pt" o:hralign="center" o:hrstd="t" o:hr="t" fillcolor="#a0a0a0" stroked="f"/>
         </w:pict>
       </w:r>
     </w:p>
@@ -5864,7 +5864,7 @@
           <w:szCs w:val="22"/>
         </w:rPr>
         <w:pict w14:anchorId="1AF26162">
-          <v:rect id="_x0000_i1114" style="width:0;height:1.5pt" o:hralign="center" o:hrstd="t" o:hr="t" fillcolor="#a0a0a0" stroked="f"/>
+          <v:rect id="_x0000_i1030" style="width:0;height:1.5pt" o:hralign="center" o:hrstd="t" o:hr="t" fillcolor="#a0a0a0" stroked="f"/>
         </w:pict>
       </w:r>
     </w:p>
@@ -6118,7 +6118,7 @@
           <w:szCs w:val="22"/>
         </w:rPr>
         <w:pict w14:anchorId="5F8EA8FE">
-          <v:rect id="_x0000_i1115" style="width:0;height:1.5pt" o:hralign="center" o:hrstd="t" o:hr="t" fillcolor="#a0a0a0" stroked="f"/>
+          <v:rect id="_x0000_i1031" style="width:0;height:1.5pt" o:hralign="center" o:hrstd="t" o:hr="t" fillcolor="#a0a0a0" stroked="f"/>
         </w:pict>
       </w:r>
     </w:p>
@@ -6492,7 +6492,7 @@
           <w:szCs w:val="22"/>
         </w:rPr>
         <w:pict w14:anchorId="7EF6018B">
-          <v:rect id="_x0000_i1116" style="width:0;height:1.5pt" o:hralign="center" o:hrstd="t" o:hr="t" fillcolor="#a0a0a0" stroked="f"/>
+          <v:rect id="_x0000_i1032" style="width:0;height:1.5pt" o:hralign="center" o:hrstd="t" o:hr="t" fillcolor="#a0a0a0" stroked="f"/>
         </w:pict>
       </w:r>
     </w:p>
@@ -6833,7 +6833,7 @@
           <w:szCs w:val="22"/>
         </w:rPr>
         <w:pict w14:anchorId="3EA63991">
-          <v:rect id="_x0000_i1117" style="width:0;height:1.5pt" o:hralign="center" o:hrstd="t" o:hr="t" fillcolor="#a0a0a0" stroked="f"/>
+          <v:rect id="_x0000_i1033" style="width:0;height:1.5pt" o:hralign="center" o:hrstd="t" o:hr="t" fillcolor="#a0a0a0" stroked="f"/>
         </w:pict>
       </w:r>
     </w:p>
@@ -8132,7 +8132,7 @@
           <w:szCs w:val="22"/>
         </w:rPr>
         <w:pict w14:anchorId="09FB4420">
-          <v:rect id="_x0000_i1118" style="width:0;height:1.5pt" o:hralign="center" o:hrstd="t" o:hr="t" fillcolor="#a0a0a0" stroked="f"/>
+          <v:rect id="_x0000_i1034" style="width:0;height:1.5pt" o:hralign="center" o:hrstd="t" o:hr="t" fillcolor="#a0a0a0" stroked="f"/>
         </w:pict>
       </w:r>
     </w:p>
@@ -8926,7 +8926,7 @@
           <w:szCs w:val="22"/>
         </w:rPr>
         <w:pict w14:anchorId="077127F1">
-          <v:rect id="_x0000_i1119" style="width:0;height:1.5pt" o:hralign="center" o:hrstd="t" o:hr="t" fillcolor="#a0a0a0" stroked="f"/>
+          <v:rect id="_x0000_i1035" style="width:0;height:1.5pt" o:hralign="center" o:hrstd="t" o:hr="t" fillcolor="#a0a0a0" stroked="f"/>
         </w:pict>
       </w:r>
     </w:p>
@@ -9359,7 +9359,7 @@
           <w:szCs w:val="22"/>
         </w:rPr>
         <w:pict w14:anchorId="1B15F164">
-          <v:rect id="_x0000_i1120" style="width:0;height:1.5pt" o:hralign="center" o:hrstd="t" o:hr="t" fillcolor="#a0a0a0" stroked="f"/>
+          <v:rect id="_x0000_i1036" style="width:0;height:1.5pt" o:hralign="center" o:hrstd="t" o:hr="t" fillcolor="#a0a0a0" stroked="f"/>
         </w:pict>
       </w:r>
     </w:p>
@@ -10221,7 +10221,7 @@
           <w:szCs w:val="22"/>
         </w:rPr>
         <w:pict w14:anchorId="33DA3C95">
-          <v:rect id="_x0000_i1121" style="width:0;height:1.5pt" o:hralign="center" o:hrstd="t" o:hr="t" fillcolor="#a0a0a0" stroked="f"/>
+          <v:rect id="_x0000_i1037" style="width:0;height:1.5pt" o:hralign="center" o:hrstd="t" o:hr="t" fillcolor="#a0a0a0" stroked="f"/>
         </w:pict>
       </w:r>
     </w:p>
@@ -10822,7 +10822,7 @@
           <w:szCs w:val="22"/>
         </w:rPr>
         <w:pict w14:anchorId="5652DCE5">
-          <v:rect id="_x0000_i1122" style="width:0;height:1.5pt" o:hralign="center" o:hrstd="t" o:hr="t" fillcolor="#a0a0a0" stroked="f"/>
+          <v:rect id="_x0000_i1038" style="width:0;height:1.5pt" o:hralign="center" o:hrstd="t" o:hr="t" fillcolor="#a0a0a0" stroked="f"/>
         </w:pict>
       </w:r>
     </w:p>
@@ -16385,6 +16385,608 @@
           <w:szCs w:val="22"/>
         </w:rPr>
         <w:t xml:space="preserve"> responde de inmediato ante cualquier duda operativa de la plataforma.</w:t>
+      </w:r>
+    </w:p>
+    <w:p>
+      <w:pPr>
+        <w:jc w:val="both"/>
+        <w:rPr>
+          <w:sz w:val="22"/>
+          <w:szCs w:val="22"/>
+        </w:rPr>
+      </w:pPr>
+    </w:p>
+    <w:p>
+      <w:pPr>
+        <w:jc w:val="both"/>
+        <w:rPr>
+          <w:sz w:val="22"/>
+          <w:szCs w:val="22"/>
+        </w:rPr>
+      </w:pPr>
+      <w:r>
+        <w:rPr>
+          <w:sz w:val="22"/>
+          <w:szCs w:val="22"/>
+        </w:rPr>
+        <w:t>MEJORAS PARA HACER 17/09</w:t>
+      </w:r>
+    </w:p>
+    <w:p>
+      <w:pPr>
+        <w:jc w:val="both"/>
+        <w:rPr>
+          <w:b/>
+          <w:bCs/>
+          <w:sz w:val="22"/>
+          <w:szCs w:val="22"/>
+        </w:rPr>
+      </w:pPr>
+      <w:r>
+        <w:rPr>
+          <w:rFonts w:ascii="Segoe UI Emoji" w:hAnsi="Segoe UI Emoji" w:cs="Segoe UI Emoji"/>
+          <w:b/>
+          <w:bCs/>
+          <w:sz w:val="22"/>
+          <w:szCs w:val="22"/>
+        </w:rPr>
+        <w:t>🚀</w:t>
+      </w:r>
+      <w:r>
+        <w:rPr>
+          <w:b/>
+          <w:bCs/>
+          <w:sz w:val="22"/>
+          <w:szCs w:val="22"/>
+        </w:rPr>
+        <w:t xml:space="preserve"> Hoja de Ruta: Funciones Clave para Campus Nika</w:t>
+      </w:r>
+    </w:p>
+    <w:p>
+      <w:pPr>
+        <w:numPr>
+          <w:ilvl w:val="0"/>
+          <w:numId w:val="23"/>
+        </w:numPr>
+        <w:jc w:val="both"/>
+        <w:rPr>
+          <w:sz w:val="22"/>
+          <w:szCs w:val="22"/>
+        </w:rPr>
+      </w:pPr>
+      <w:r>
+        <w:rPr>
+          <w:b/>
+          <w:bCs/>
+          <w:sz w:val="22"/>
+          <w:szCs w:val="22"/>
+        </w:rPr>
+        <w:t>Chat Privado entre Amigos con "Compartir Pregunta"</w:t>
+      </w:r>
+    </w:p>
+    <w:p>
+      <w:pPr>
+        <w:numPr>
+          <w:ilvl w:val="1"/>
+          <w:numId w:val="23"/>
+        </w:numPr>
+        <w:jc w:val="both"/>
+        <w:rPr>
+          <w:sz w:val="22"/>
+          <w:szCs w:val="22"/>
+        </w:rPr>
+      </w:pPr>
+      <w:r>
+        <w:rPr>
+          <w:sz w:val="22"/>
+          <w:szCs w:val="22"/>
+        </w:rPr>
+        <w:t>Habilitar mensajería directa en tiempo real entre los colegas de la red.</w:t>
+      </w:r>
+    </w:p>
+    <w:p>
+      <w:pPr>
+        <w:numPr>
+          <w:ilvl w:val="1"/>
+          <w:numId w:val="23"/>
+        </w:numPr>
+        <w:jc w:val="both"/>
+        <w:rPr>
+          <w:sz w:val="22"/>
+          <w:szCs w:val="22"/>
+        </w:rPr>
+      </w:pPr>
+      <w:r>
+        <w:rPr>
+          <w:b/>
+          <w:bCs/>
+          <w:sz w:val="22"/>
+          <w:szCs w:val="22"/>
+        </w:rPr>
+        <w:t>La clave:</w:t>
+      </w:r>
+      <w:r>
+        <w:rPr>
+          <w:sz w:val="22"/>
+          <w:szCs w:val="22"/>
+        </w:rPr>
+        <w:t xml:space="preserve"> Un botón </w:t>
+      </w:r>
+      <w:r>
+        <w:rPr>
+          <w:i/>
+          <w:iCs/>
+          <w:sz w:val="22"/>
+          <w:szCs w:val="22"/>
+        </w:rPr>
+        <w:t xml:space="preserve">"Compartir al chat </w:t>
+      </w:r>
+      <w:r>
+        <w:rPr>
+          <w:rFonts w:ascii="Segoe UI Emoji" w:hAnsi="Segoe UI Emoji" w:cs="Segoe UI Emoji"/>
+          <w:i/>
+          <w:iCs/>
+          <w:sz w:val="22"/>
+          <w:szCs w:val="22"/>
+        </w:rPr>
+        <w:t>💬</w:t>
+      </w:r>
+      <w:r>
+        <w:rPr>
+          <w:i/>
+          <w:iCs/>
+          <w:sz w:val="22"/>
+          <w:szCs w:val="22"/>
+        </w:rPr>
+        <w:t>"</w:t>
+      </w:r>
+      <w:r>
+        <w:rPr>
+          <w:sz w:val="22"/>
+          <w:szCs w:val="22"/>
+        </w:rPr>
+        <w:t xml:space="preserve"> en las preguntas de los simulacros o del banco para mandar el caso directo a un chat y debatir por qué era una opción y no otra según la bibliografía.</w:t>
+      </w:r>
+    </w:p>
+    <w:p>
+      <w:pPr>
+        <w:numPr>
+          <w:ilvl w:val="0"/>
+          <w:numId w:val="23"/>
+        </w:numPr>
+        <w:jc w:val="both"/>
+        <w:rPr>
+          <w:sz w:val="22"/>
+          <w:szCs w:val="22"/>
+        </w:rPr>
+      </w:pPr>
+      <w:proofErr w:type="spellStart"/>
+      <w:r>
+        <w:rPr>
+          <w:b/>
+          <w:bCs/>
+          <w:sz w:val="22"/>
+          <w:szCs w:val="22"/>
+        </w:rPr>
+        <w:t>Pomodoro</w:t>
+      </w:r>
+      <w:proofErr w:type="spellEnd"/>
+      <w:r>
+        <w:rPr>
+          <w:b/>
+          <w:bCs/>
+          <w:sz w:val="22"/>
+          <w:szCs w:val="22"/>
+        </w:rPr>
+        <w:t xml:space="preserve"> Sincronizado ("Modo Biblioteca")</w:t>
+      </w:r>
+    </w:p>
+    <w:p>
+      <w:pPr>
+        <w:numPr>
+          <w:ilvl w:val="1"/>
+          <w:numId w:val="23"/>
+        </w:numPr>
+        <w:jc w:val="both"/>
+        <w:rPr>
+          <w:sz w:val="22"/>
+          <w:szCs w:val="22"/>
+        </w:rPr>
+      </w:pPr>
+      <w:r>
+        <w:rPr>
+          <w:sz w:val="22"/>
+          <w:szCs w:val="22"/>
+        </w:rPr>
+        <w:t>Indicador en tiempo real en la lista de amigos (</w:t>
+      </w:r>
+      <w:r>
+        <w:rPr>
+          <w:i/>
+          <w:iCs/>
+          <w:sz w:val="22"/>
+          <w:szCs w:val="22"/>
+        </w:rPr>
+        <w:t xml:space="preserve">"Estudiando UP3 - </w:t>
+      </w:r>
+      <w:proofErr w:type="spellStart"/>
+      <w:r>
+        <w:rPr>
+          <w:i/>
+          <w:iCs/>
+          <w:sz w:val="22"/>
+          <w:szCs w:val="22"/>
+        </w:rPr>
+        <w:t>Pomodoro</w:t>
+      </w:r>
+      <w:proofErr w:type="spellEnd"/>
+      <w:r>
+        <w:rPr>
+          <w:i/>
+          <w:iCs/>
+          <w:sz w:val="22"/>
+          <w:szCs w:val="22"/>
+        </w:rPr>
+        <w:t xml:space="preserve"> activo"</w:t>
+      </w:r>
+      <w:r>
+        <w:rPr>
+          <w:sz w:val="22"/>
+          <w:szCs w:val="22"/>
+        </w:rPr>
+        <w:t>).</w:t>
+      </w:r>
+    </w:p>
+    <w:p>
+      <w:pPr>
+        <w:numPr>
+          <w:ilvl w:val="1"/>
+          <w:numId w:val="23"/>
+        </w:numPr>
+        <w:jc w:val="both"/>
+        <w:rPr>
+          <w:sz w:val="22"/>
+          <w:szCs w:val="22"/>
+        </w:rPr>
+      </w:pPr>
+      <w:r>
+        <w:rPr>
+          <w:sz w:val="22"/>
+          <w:szCs w:val="22"/>
+        </w:rPr>
+        <w:t xml:space="preserve">Botón de </w:t>
+      </w:r>
+      <w:r>
+        <w:rPr>
+          <w:i/>
+          <w:iCs/>
+          <w:sz w:val="22"/>
+          <w:szCs w:val="22"/>
+        </w:rPr>
+        <w:t xml:space="preserve">"Unirme al </w:t>
+      </w:r>
+      <w:proofErr w:type="spellStart"/>
+      <w:r>
+        <w:rPr>
+          <w:i/>
+          <w:iCs/>
+          <w:sz w:val="22"/>
+          <w:szCs w:val="22"/>
+        </w:rPr>
+        <w:t>Pomodoro</w:t>
+      </w:r>
+      <w:proofErr w:type="spellEnd"/>
+      <w:r>
+        <w:rPr>
+          <w:i/>
+          <w:iCs/>
+          <w:sz w:val="22"/>
+          <w:szCs w:val="22"/>
+        </w:rPr>
+        <w:t>"</w:t>
+      </w:r>
+      <w:r>
+        <w:rPr>
+          <w:sz w:val="22"/>
+          <w:szCs w:val="22"/>
+        </w:rPr>
+        <w:t xml:space="preserve"> para compartir la sesión de concentración y sincronizar los tiempos de estudio con los pibes.</w:t>
+      </w:r>
+    </w:p>
+    <w:p>
+      <w:pPr>
+        <w:numPr>
+          <w:ilvl w:val="0"/>
+          <w:numId w:val="23"/>
+        </w:numPr>
+        <w:jc w:val="both"/>
+        <w:rPr>
+          <w:sz w:val="22"/>
+          <w:szCs w:val="22"/>
+        </w:rPr>
+      </w:pPr>
+      <w:r>
+        <w:rPr>
+          <w:b/>
+          <w:bCs/>
+          <w:sz w:val="22"/>
+          <w:szCs w:val="22"/>
+        </w:rPr>
+        <w:t>Asistente Proactivo Post-Simulacro</w:t>
+      </w:r>
+    </w:p>
+    <w:p>
+      <w:pPr>
+        <w:numPr>
+          <w:ilvl w:val="1"/>
+          <w:numId w:val="23"/>
+        </w:numPr>
+        <w:jc w:val="both"/>
+        <w:rPr>
+          <w:sz w:val="22"/>
+          <w:szCs w:val="22"/>
+        </w:rPr>
+      </w:pPr>
+      <w:r>
+        <w:rPr>
+          <w:sz w:val="22"/>
+          <w:szCs w:val="22"/>
+        </w:rPr>
+        <w:t xml:space="preserve">Análisis inteligente al terminar el examen: si el usuario erró varias preguntas seguidas de un mismo tema, el asistente salta </w:t>
+      </w:r>
+      <w:r>
+        <w:rPr>
+          <w:b/>
+          <w:bCs/>
+          <w:sz w:val="22"/>
+          <w:szCs w:val="22"/>
+        </w:rPr>
+        <w:t>al finalizar</w:t>
+      </w:r>
+      <w:r>
+        <w:rPr>
+          <w:sz w:val="22"/>
+          <w:szCs w:val="22"/>
+        </w:rPr>
+        <w:t xml:space="preserve"> para proponer un repaso rápido de los puntos clave de esa UP.</w:t>
+      </w:r>
+    </w:p>
+    <w:p>
+      <w:pPr>
+        <w:numPr>
+          <w:ilvl w:val="0"/>
+          <w:numId w:val="23"/>
+        </w:numPr>
+        <w:jc w:val="both"/>
+        <w:rPr>
+          <w:sz w:val="22"/>
+          <w:szCs w:val="22"/>
+        </w:rPr>
+      </w:pPr>
+      <w:r>
+        <w:rPr>
+          <w:b/>
+          <w:bCs/>
+          <w:sz w:val="22"/>
+          <w:szCs w:val="22"/>
+        </w:rPr>
+        <w:t>Tip del Día Personalizado por la IA</w:t>
+      </w:r>
+    </w:p>
+    <w:p>
+      <w:pPr>
+        <w:numPr>
+          <w:ilvl w:val="1"/>
+          <w:numId w:val="23"/>
+        </w:numPr>
+        <w:jc w:val="both"/>
+        <w:rPr>
+          <w:sz w:val="22"/>
+          <w:szCs w:val="22"/>
+        </w:rPr>
+      </w:pPr>
+      <w:r>
+        <w:rPr>
+          <w:sz w:val="22"/>
+          <w:szCs w:val="22"/>
+        </w:rPr>
+        <w:t xml:space="preserve">Un recuadro en el </w:t>
+      </w:r>
+      <w:proofErr w:type="spellStart"/>
+      <w:r>
+        <w:rPr>
+          <w:sz w:val="22"/>
+          <w:szCs w:val="22"/>
+        </w:rPr>
+        <w:t>dashboard</w:t>
+      </w:r>
+      <w:proofErr w:type="spellEnd"/>
+      <w:r>
+        <w:rPr>
+          <w:sz w:val="22"/>
+          <w:szCs w:val="22"/>
+        </w:rPr>
+        <w:t xml:space="preserve"> donde la IA genera un "consejo del día" o </w:t>
+      </w:r>
+      <w:proofErr w:type="spellStart"/>
+      <w:r>
+        <w:rPr>
+          <w:sz w:val="22"/>
+          <w:szCs w:val="22"/>
+        </w:rPr>
+        <w:t>mini-resumen</w:t>
+      </w:r>
+      <w:proofErr w:type="spellEnd"/>
+      <w:r>
+        <w:rPr>
+          <w:sz w:val="22"/>
+          <w:szCs w:val="22"/>
+        </w:rPr>
+        <w:t xml:space="preserve"> basado en los </w:t>
+      </w:r>
+      <w:proofErr w:type="spellStart"/>
+      <w:r>
+        <w:rPr>
+          <w:i/>
+          <w:iCs/>
+          <w:sz w:val="22"/>
+          <w:szCs w:val="22"/>
+        </w:rPr>
+        <w:t>Pain</w:t>
+      </w:r>
+      <w:proofErr w:type="spellEnd"/>
+      <w:r>
+        <w:rPr>
+          <w:i/>
+          <w:iCs/>
+          <w:sz w:val="22"/>
+          <w:szCs w:val="22"/>
+        </w:rPr>
+        <w:t xml:space="preserve"> </w:t>
+      </w:r>
+      <w:proofErr w:type="spellStart"/>
+      <w:r>
+        <w:rPr>
+          <w:i/>
+          <w:iCs/>
+          <w:sz w:val="22"/>
+          <w:szCs w:val="22"/>
+        </w:rPr>
+        <w:t>Points</w:t>
+      </w:r>
+      <w:proofErr w:type="spellEnd"/>
+      <w:r>
+        <w:rPr>
+          <w:sz w:val="22"/>
+          <w:szCs w:val="22"/>
+        </w:rPr>
+        <w:t xml:space="preserve"> (las preguntas que más fallan en general o los temas más flojos del usuario).</w:t>
+      </w:r>
+    </w:p>
+    <w:p>
+      <w:pPr>
+        <w:numPr>
+          <w:ilvl w:val="0"/>
+          <w:numId w:val="23"/>
+        </w:numPr>
+        <w:jc w:val="both"/>
+        <w:rPr>
+          <w:sz w:val="22"/>
+          <w:szCs w:val="22"/>
+        </w:rPr>
+      </w:pPr>
+      <w:r>
+        <w:rPr>
+          <w:b/>
+          <w:bCs/>
+          <w:sz w:val="22"/>
+          <w:szCs w:val="22"/>
+        </w:rPr>
+        <w:t>Optimización Técnica (PWA y CSS Externo)</w:t>
+      </w:r>
+    </w:p>
+    <w:p>
+      <w:pPr>
+        <w:numPr>
+          <w:ilvl w:val="1"/>
+          <w:numId w:val="23"/>
+        </w:numPr>
+        <w:jc w:val="both"/>
+        <w:rPr>
+          <w:sz w:val="22"/>
+          <w:szCs w:val="22"/>
+        </w:rPr>
+      </w:pPr>
+      <w:r>
+        <w:rPr>
+          <w:sz w:val="22"/>
+          <w:szCs w:val="22"/>
+        </w:rPr>
+        <w:t>Separar las casi 3000 líneas de estilos del &lt;</w:t>
+      </w:r>
+      <w:proofErr w:type="spellStart"/>
+      <w:r>
+        <w:rPr>
+          <w:sz w:val="22"/>
+          <w:szCs w:val="22"/>
+        </w:rPr>
+        <w:t>style</w:t>
+      </w:r>
+      <w:proofErr w:type="spellEnd"/>
+      <w:r>
+        <w:rPr>
+          <w:sz w:val="22"/>
+          <w:szCs w:val="22"/>
+        </w:rPr>
+        <w:t>&gt; de campus.html a un archivo styles.css externo para que la página vuele.</w:t>
+      </w:r>
+    </w:p>
+    <w:p>
+      <w:pPr>
+        <w:numPr>
+          <w:ilvl w:val="1"/>
+          <w:numId w:val="23"/>
+        </w:numPr>
+        <w:jc w:val="both"/>
+        <w:rPr>
+          <w:sz w:val="22"/>
+          <w:szCs w:val="22"/>
+        </w:rPr>
+      </w:pPr>
+      <w:r>
+        <w:rPr>
+          <w:sz w:val="22"/>
+          <w:szCs w:val="22"/>
+        </w:rPr>
+        <w:t xml:space="preserve">Implementar un </w:t>
+      </w:r>
+      <w:proofErr w:type="spellStart"/>
+      <w:r>
+        <w:rPr>
+          <w:sz w:val="22"/>
+          <w:szCs w:val="22"/>
+        </w:rPr>
+        <w:t>Service</w:t>
+      </w:r>
+      <w:proofErr w:type="spellEnd"/>
+      <w:r>
+        <w:rPr>
+          <w:sz w:val="22"/>
+          <w:szCs w:val="22"/>
+        </w:rPr>
+        <w:t xml:space="preserve"> </w:t>
+      </w:r>
+      <w:proofErr w:type="spellStart"/>
+      <w:r>
+        <w:rPr>
+          <w:sz w:val="22"/>
+          <w:szCs w:val="22"/>
+        </w:rPr>
+        <w:t>Worker</w:t>
+      </w:r>
+      <w:proofErr w:type="spellEnd"/>
+      <w:r>
+        <w:rPr>
+          <w:sz w:val="22"/>
+          <w:szCs w:val="22"/>
+        </w:rPr>
+        <w:t xml:space="preserve"> básico para que la plataforma sea </w:t>
+      </w:r>
+      <w:r>
+        <w:rPr>
+          <w:b/>
+          <w:bCs/>
+          <w:sz w:val="22"/>
+          <w:szCs w:val="22"/>
+        </w:rPr>
+        <w:t>instalable como app nativa</w:t>
+      </w:r>
+      <w:r>
+        <w:rPr>
+          <w:sz w:val="22"/>
+          <w:szCs w:val="22"/>
+        </w:rPr>
+        <w:t xml:space="preserve"> en la pantalla de inicio del celu.</w:t>
       </w:r>
     </w:p>
     <w:p>
@@ -18577,6 +19179,123 @@
     </w:lvl>
   </w:abstractNum>
   <w:abstractNum w:abstractNumId="16" w15:restartNumberingAfterBreak="0">
+    <w:nsid w:val="5CDA4F47"/>
+    <w:multiLevelType w:val="multilevel"/>
+    <w:tmpl w:val="2AE4D5DA"/>
+    <w:lvl w:ilvl="0">
+      <w:start w:val="1"/>
+      <w:numFmt w:val="decimal"/>
+      <w:lvlText w:val="%1."/>
+      <w:lvlJc w:val="left"/>
+      <w:pPr>
+        <w:tabs>
+          <w:tab w:val="num" w:pos="720"/>
+        </w:tabs>
+        <w:ind w:left="720" w:hanging="360"/>
+      </w:pPr>
+    </w:lvl>
+    <w:lvl w:ilvl="1">
+      <w:start w:val="1"/>
+      <w:numFmt w:val="bullet"/>
+      <w:lvlText w:val="o"/>
+      <w:lvlJc w:val="left"/>
+      <w:pPr>
+        <w:tabs>
+          <w:tab w:val="num" w:pos="1440"/>
+        </w:tabs>
+        <w:ind w:left="1440" w:hanging="360"/>
+      </w:pPr>
+      <w:rPr>
+        <w:rFonts w:ascii="Courier New" w:hAnsi="Courier New" w:hint="default"/>
+        <w:sz w:val="20"/>
+      </w:rPr>
+    </w:lvl>
+    <w:lvl w:ilvl="2" w:tentative="1">
+      <w:start w:val="1"/>
+      <w:numFmt w:val="decimal"/>
+      <w:lvlText w:val="%3."/>
+      <w:lvlJc w:val="left"/>
+      <w:pPr>
+        <w:tabs>
+          <w:tab w:val="num" w:pos="2160"/>
+        </w:tabs>
+        <w:ind w:left="2160" w:hanging="360"/>
+      </w:pPr>
+    </w:lvl>
+    <w:lvl w:ilvl="3" w:tentative="1">
+      <w:start w:val="1"/>
+      <w:numFmt w:val="decimal"/>
+      <w:lvlText w:val="%4."/>
+      <w:lvlJc w:val="left"/>
+      <w:pPr>
+        <w:tabs>
+          <w:tab w:val="num" w:pos="2880"/>
+        </w:tabs>
+        <w:ind w:left="2880" w:hanging="360"/>
+      </w:pPr>
+    </w:lvl>
+    <w:lvl w:ilvl="4" w:tentative="1">
+      <w:start w:val="1"/>
+      <w:numFmt w:val="decimal"/>
+      <w:lvlText w:val="%5."/>
+      <w:lvlJc w:val="left"/>
+      <w:pPr>
+        <w:tabs>
+          <w:tab w:val="num" w:pos="3600"/>
+        </w:tabs>
+        <w:ind w:left="3600" w:hanging="360"/>
+      </w:pPr>
+    </w:lvl>
+    <w:lvl w:ilvl="5" w:tentative="1">
+      <w:start w:val="1"/>
+      <w:numFmt w:val="decimal"/>
+      <w:lvlText w:val="%6."/>
+      <w:lvlJc w:val="left"/>
+      <w:pPr>
+        <w:tabs>
+          <w:tab w:val="num" w:pos="4320"/>
+        </w:tabs>
+        <w:ind w:left="4320" w:hanging="360"/>
+      </w:pPr>
+    </w:lvl>
+    <w:lvl w:ilvl="6" w:tentative="1">
+      <w:start w:val="1"/>
+      <w:numFmt w:val="decimal"/>
+      <w:lvlText w:val="%7."/>
+      <w:lvlJc w:val="left"/>
+      <w:pPr>
+        <w:tabs>
+          <w:tab w:val="num" w:pos="5040"/>
+        </w:tabs>
+        <w:ind w:left="5040" w:hanging="360"/>
+      </w:pPr>
+    </w:lvl>
+    <w:lvl w:ilvl="7" w:tentative="1">
+      <w:start w:val="1"/>
+      <w:numFmt w:val="decimal"/>
+      <w:lvlText w:val="%8."/>
+      <w:lvlJc w:val="left"/>
+      <w:pPr>
+        <w:tabs>
+          <w:tab w:val="num" w:pos="5760"/>
+        </w:tabs>
+        <w:ind w:left="5760" w:hanging="360"/>
+      </w:pPr>
+    </w:lvl>
+    <w:lvl w:ilvl="8" w:tentative="1">
+      <w:start w:val="1"/>
+      <w:numFmt w:val="decimal"/>
+      <w:lvlText w:val="%9."/>
+      <w:lvlJc w:val="left"/>
+      <w:pPr>
+        <w:tabs>
+          <w:tab w:val="num" w:pos="6480"/>
+        </w:tabs>
+        <w:ind w:left="6480" w:hanging="360"/>
+      </w:pPr>
+    </w:lvl>
+  </w:abstractNum>
+  <w:abstractNum w:abstractNumId="17" w15:restartNumberingAfterBreak="0">
     <w:nsid w:val="5F574A47"/>
     <w:multiLevelType w:val="multilevel"/>
     <w:tmpl w:val="A40A7BE4"/>
@@ -18725,7 +19444,7 @@
       </w:rPr>
     </w:lvl>
   </w:abstractNum>
-  <w:abstractNum w:abstractNumId="17" w15:restartNumberingAfterBreak="0">
+  <w:abstractNum w:abstractNumId="18" w15:restartNumberingAfterBreak="0">
     <w:nsid w:val="663F5A64"/>
     <w:multiLevelType w:val="multilevel"/>
     <w:tmpl w:val="DD3CF118"/>
@@ -18842,7 +19561,7 @@
       </w:pPr>
     </w:lvl>
   </w:abstractNum>
-  <w:abstractNum w:abstractNumId="18" w15:restartNumberingAfterBreak="0">
+  <w:abstractNum w:abstractNumId="19" w15:restartNumberingAfterBreak="0">
     <w:nsid w:val="681D5F99"/>
     <w:multiLevelType w:val="multilevel"/>
     <w:tmpl w:val="8E0867BE"/>
@@ -18991,7 +19710,7 @@
       </w:rPr>
     </w:lvl>
   </w:abstractNum>
-  <w:abstractNum w:abstractNumId="19" w15:restartNumberingAfterBreak="0">
+  <w:abstractNum w:abstractNumId="20" w15:restartNumberingAfterBreak="0">
     <w:nsid w:val="714415F7"/>
     <w:multiLevelType w:val="multilevel"/>
     <w:tmpl w:val="931E81C4"/>
@@ -19104,7 +19823,7 @@
       </w:pPr>
     </w:lvl>
   </w:abstractNum>
-  <w:abstractNum w:abstractNumId="20" w15:restartNumberingAfterBreak="0">
+  <w:abstractNum w:abstractNumId="21" w15:restartNumberingAfterBreak="0">
     <w:nsid w:val="76A32368"/>
     <w:multiLevelType w:val="multilevel"/>
     <w:tmpl w:val="23DAC3B4"/>
@@ -19249,7 +19968,7 @@
       </w:rPr>
     </w:lvl>
   </w:abstractNum>
-  <w:abstractNum w:abstractNumId="21" w15:restartNumberingAfterBreak="0">
+  <w:abstractNum w:abstractNumId="22" w15:restartNumberingAfterBreak="0">
     <w:nsid w:val="7A5431A0"/>
     <w:multiLevelType w:val="multilevel"/>
     <w:tmpl w:val="2048F370"/>
@@ -19370,7 +20089,7 @@
     <w:abstractNumId w:val="5"/>
   </w:num>
   <w:num w:numId="2" w16cid:durableId="1549295392">
-    <w:abstractNumId w:val="17"/>
+    <w:abstractNumId w:val="18"/>
   </w:num>
   <w:num w:numId="3" w16cid:durableId="1453669364">
     <w:abstractNumId w:val="7"/>
@@ -19382,7 +20101,7 @@
     <w:abstractNumId w:val="2"/>
   </w:num>
   <w:num w:numId="6" w16cid:durableId="1360736285">
-    <w:abstractNumId w:val="21"/>
+    <w:abstractNumId w:val="22"/>
   </w:num>
   <w:num w:numId="7" w16cid:durableId="1234314148">
     <w:abstractNumId w:val="0"/>
@@ -19391,7 +20110,7 @@
     <w:abstractNumId w:val="1"/>
   </w:num>
   <w:num w:numId="9" w16cid:durableId="1703555296">
-    <w:abstractNumId w:val="19"/>
+    <w:abstractNumId w:val="20"/>
   </w:num>
   <w:num w:numId="10" w16cid:durableId="1134906380">
     <w:abstractNumId w:val="4"/>
@@ -19400,7 +20119,7 @@
     <w:abstractNumId w:val="10"/>
   </w:num>
   <w:num w:numId="12" w16cid:durableId="897983578">
-    <w:abstractNumId w:val="20"/>
+    <w:abstractNumId w:val="21"/>
   </w:num>
   <w:num w:numId="13" w16cid:durableId="1128160474">
     <w:abstractNumId w:val="11"/>
@@ -19421,16 +20140,19 @@
     <w:abstractNumId w:val="12"/>
   </w:num>
   <w:num w:numId="19" w16cid:durableId="973099603">
-    <w:abstractNumId w:val="16"/>
+    <w:abstractNumId w:val="17"/>
   </w:num>
   <w:num w:numId="20" w16cid:durableId="975914397">
-    <w:abstractNumId w:val="18"/>
+    <w:abstractNumId w:val="19"/>
   </w:num>
   <w:num w:numId="21" w16cid:durableId="355621761">
     <w:abstractNumId w:val="15"/>
   </w:num>
   <w:num w:numId="22" w16cid:durableId="1670059583">
     <w:abstractNumId w:val="9"/>
+  </w:num>
+  <w:num w:numId="23" w16cid:durableId="1599286283">
+    <w:abstractNumId w:val="16"/>
   </w:num>
 </w:numbering>
 </file>

</xml_diff>

<commit_message>
feat: integracion de login con Google OAuth nativo
</commit_message>
<xml_diff>
--- a/proyecto campus virtual.docx
+++ b/proyecto campus virtual.docx
@@ -15723,6 +15723,1450 @@
           <w:szCs w:val="22"/>
         </w:rPr>
       </w:pPr>
+    </w:p>
+    <w:p>
+      <w:pPr>
+        <w:jc w:val="both"/>
+        <w:rPr>
+          <w:b/>
+          <w:bCs/>
+          <w:sz w:val="22"/>
+          <w:szCs w:val="22"/>
+        </w:rPr>
+      </w:pPr>
+    </w:p>
+    <w:p>
+      <w:pPr>
+        <w:jc w:val="both"/>
+        <w:rPr>
+          <w:b/>
+          <w:bCs/>
+          <w:sz w:val="22"/>
+          <w:szCs w:val="22"/>
+        </w:rPr>
+      </w:pPr>
+    </w:p>
+    <w:p>
+      <w:pPr>
+        <w:jc w:val="both"/>
+        <w:rPr>
+          <w:b/>
+          <w:bCs/>
+          <w:sz w:val="22"/>
+          <w:szCs w:val="22"/>
+        </w:rPr>
+      </w:pPr>
+    </w:p>
+    <w:p>
+      <w:pPr>
+        <w:jc w:val="both"/>
+        <w:rPr>
+          <w:b/>
+          <w:bCs/>
+          <w:sz w:val="22"/>
+          <w:szCs w:val="22"/>
+        </w:rPr>
+      </w:pPr>
+    </w:p>
+    <w:p>
+      <w:pPr>
+        <w:jc w:val="both"/>
+        <w:rPr>
+          <w:b/>
+          <w:bCs/>
+          <w:sz w:val="22"/>
+          <w:szCs w:val="22"/>
+        </w:rPr>
+      </w:pPr>
+    </w:p>
+    <w:p>
+      <w:pPr>
+        <w:jc w:val="both"/>
+        <w:rPr>
+          <w:b/>
+          <w:bCs/>
+          <w:sz w:val="22"/>
+          <w:szCs w:val="22"/>
+        </w:rPr>
+      </w:pPr>
+    </w:p>
+    <w:p>
+      <w:pPr>
+        <w:jc w:val="both"/>
+        <w:rPr>
+          <w:b/>
+          <w:bCs/>
+          <w:sz w:val="22"/>
+          <w:szCs w:val="22"/>
+        </w:rPr>
+      </w:pPr>
+    </w:p>
+    <w:p>
+      <w:pPr>
+        <w:jc w:val="both"/>
+        <w:rPr>
+          <w:b/>
+          <w:bCs/>
+          <w:sz w:val="22"/>
+          <w:szCs w:val="22"/>
+        </w:rPr>
+      </w:pPr>
+    </w:p>
+    <w:p>
+      <w:pPr>
+        <w:jc w:val="both"/>
+        <w:rPr>
+          <w:b/>
+          <w:bCs/>
+          <w:sz w:val="22"/>
+          <w:szCs w:val="22"/>
+        </w:rPr>
+      </w:pPr>
+    </w:p>
+    <w:p>
+      <w:pPr>
+        <w:jc w:val="both"/>
+        <w:rPr>
+          <w:b/>
+          <w:bCs/>
+          <w:sz w:val="22"/>
+          <w:szCs w:val="22"/>
+        </w:rPr>
+      </w:pPr>
+    </w:p>
+    <w:p>
+      <w:pPr>
+        <w:jc w:val="both"/>
+        <w:rPr>
+          <w:b/>
+          <w:bCs/>
+          <w:sz w:val="22"/>
+          <w:szCs w:val="22"/>
+        </w:rPr>
+      </w:pPr>
+    </w:p>
+    <w:p>
+      <w:pPr>
+        <w:jc w:val="both"/>
+        <w:rPr>
+          <w:b/>
+          <w:bCs/>
+          <w:sz w:val="22"/>
+          <w:szCs w:val="22"/>
+        </w:rPr>
+      </w:pPr>
+    </w:p>
+    <w:p>
+      <w:pPr>
+        <w:jc w:val="both"/>
+        <w:rPr>
+          <w:b/>
+          <w:bCs/>
+          <w:sz w:val="22"/>
+          <w:szCs w:val="22"/>
+        </w:rPr>
+      </w:pPr>
+    </w:p>
+    <w:p>
+      <w:pPr>
+        <w:jc w:val="both"/>
+        <w:rPr>
+          <w:b/>
+          <w:bCs/>
+          <w:sz w:val="22"/>
+          <w:szCs w:val="22"/>
+        </w:rPr>
+      </w:pPr>
+    </w:p>
+    <w:p>
+      <w:pPr>
+        <w:jc w:val="both"/>
+        <w:rPr>
+          <w:b/>
+          <w:bCs/>
+          <w:sz w:val="22"/>
+          <w:szCs w:val="22"/>
+        </w:rPr>
+      </w:pPr>
+    </w:p>
+    <w:p>
+      <w:pPr>
+        <w:jc w:val="both"/>
+        <w:rPr>
+          <w:b/>
+          <w:bCs/>
+          <w:sz w:val="22"/>
+          <w:szCs w:val="22"/>
+        </w:rPr>
+      </w:pPr>
+      <w:r>
+        <w:rPr>
+          <w:b/>
+          <w:bCs/>
+          <w:sz w:val="22"/>
+          <w:szCs w:val="22"/>
+        </w:rPr>
+        <w:lastRenderedPageBreak/>
+        <w:t>CAMBIOS QUE FALTAN REALIZAR 17/09 17hs</w:t>
+      </w:r>
+    </w:p>
+    <w:p>
+      <w:pPr>
+        <w:jc w:val="both"/>
+        <w:rPr>
+          <w:sz w:val="22"/>
+          <w:szCs w:val="22"/>
+        </w:rPr>
+      </w:pPr>
+      <w:r>
+        <w:rPr>
+          <w:sz w:val="22"/>
+          <w:szCs w:val="22"/>
+        </w:rPr>
+        <w:t>1. Perfiles Públicos de Usuarios</w:t>
+      </w:r>
+    </w:p>
+    <w:p>
+      <w:pPr>
+        <w:numPr>
+          <w:ilvl w:val="0"/>
+          <w:numId w:val="24"/>
+        </w:numPr>
+        <w:jc w:val="both"/>
+        <w:rPr>
+          <w:sz w:val="22"/>
+          <w:szCs w:val="22"/>
+        </w:rPr>
+      </w:pPr>
+      <w:r>
+        <w:rPr>
+          <w:sz w:val="22"/>
+          <w:szCs w:val="22"/>
+        </w:rPr>
+        <w:t>Modal de perfil (</w:t>
+      </w:r>
+      <w:proofErr w:type="spellStart"/>
+      <w:r>
+        <w:rPr>
+          <w:sz w:val="22"/>
+          <w:szCs w:val="22"/>
+        </w:rPr>
+        <w:t>public</w:t>
+      </w:r>
+      <w:proofErr w:type="spellEnd"/>
+      <w:r>
+        <w:rPr>
+          <w:sz w:val="22"/>
+          <w:szCs w:val="22"/>
+        </w:rPr>
+        <w:t>-</w:t>
+      </w:r>
+      <w:proofErr w:type="spellStart"/>
+      <w:r>
+        <w:rPr>
+          <w:sz w:val="22"/>
+          <w:szCs w:val="22"/>
+        </w:rPr>
+        <w:t>profile</w:t>
+      </w:r>
+      <w:proofErr w:type="spellEnd"/>
+      <w:r>
+        <w:rPr>
+          <w:sz w:val="22"/>
+          <w:szCs w:val="22"/>
+        </w:rPr>
+        <w:t>-modal): Diseñar e insertar la estructura en campus.html con avatar grande, nombre completo y @username.</w:t>
+      </w:r>
+    </w:p>
+    <w:p>
+      <w:pPr>
+        <w:numPr>
+          <w:ilvl w:val="0"/>
+          <w:numId w:val="24"/>
+        </w:numPr>
+        <w:jc w:val="both"/>
+        <w:rPr>
+          <w:sz w:val="22"/>
+          <w:szCs w:val="22"/>
+        </w:rPr>
+      </w:pPr>
+      <w:r>
+        <w:rPr>
+          <w:sz w:val="22"/>
+          <w:szCs w:val="22"/>
+        </w:rPr>
+        <w:t xml:space="preserve">Campos requeridos: </w:t>
+      </w:r>
+      <w:proofErr w:type="spellStart"/>
+      <w:r>
+        <w:rPr>
+          <w:sz w:val="22"/>
+          <w:szCs w:val="22"/>
+        </w:rPr>
+        <w:t>Badge</w:t>
+      </w:r>
+      <w:proofErr w:type="spellEnd"/>
+      <w:r>
+        <w:rPr>
+          <w:sz w:val="22"/>
+          <w:szCs w:val="22"/>
+        </w:rPr>
+        <w:t xml:space="preserve"> o selector de Año de Cursada (1° a 5° año o Estudiante Independiente), Biografía (bio) y sección para enlaces de Redes Sociales.</w:t>
+      </w:r>
+    </w:p>
+    <w:p>
+      <w:pPr>
+        <w:numPr>
+          <w:ilvl w:val="0"/>
+          <w:numId w:val="24"/>
+        </w:numPr>
+        <w:jc w:val="both"/>
+        <w:rPr>
+          <w:sz w:val="22"/>
+          <w:szCs w:val="22"/>
+        </w:rPr>
+      </w:pPr>
+      <w:r>
+        <w:rPr>
+          <w:sz w:val="22"/>
+          <w:szCs w:val="22"/>
+        </w:rPr>
+        <w:t>Acciones sociales: Contador de amigos y botón "</w:t>
+      </w:r>
+      <w:r>
+        <w:rPr>
+          <w:rFonts w:ascii="Segoe UI Emoji" w:hAnsi="Segoe UI Emoji" w:cs="Segoe UI Emoji"/>
+          <w:sz w:val="22"/>
+          <w:szCs w:val="22"/>
+        </w:rPr>
+        <w:t>➕</w:t>
+      </w:r>
+      <w:r>
+        <w:rPr>
+          <w:sz w:val="22"/>
+          <w:szCs w:val="22"/>
+        </w:rPr>
+        <w:t xml:space="preserve"> Enviar Solicitud de Amistad" adentro del propio modal.</w:t>
+      </w:r>
+    </w:p>
+    <w:p>
+      <w:pPr>
+        <w:numPr>
+          <w:ilvl w:val="0"/>
+          <w:numId w:val="24"/>
+        </w:numPr>
+        <w:jc w:val="both"/>
+        <w:rPr>
+          <w:sz w:val="22"/>
+          <w:szCs w:val="22"/>
+        </w:rPr>
+      </w:pPr>
+      <w:r>
+        <w:rPr>
+          <w:sz w:val="22"/>
+          <w:szCs w:val="22"/>
+        </w:rPr>
+        <w:t xml:space="preserve">Lógica de consulta: Crear la función </w:t>
+      </w:r>
+      <w:proofErr w:type="spellStart"/>
+      <w:r>
+        <w:rPr>
+          <w:sz w:val="22"/>
+          <w:szCs w:val="22"/>
+        </w:rPr>
+        <w:t>abrirPerfilPublico</w:t>
+      </w:r>
+      <w:proofErr w:type="spellEnd"/>
+      <w:r>
+        <w:rPr>
+          <w:sz w:val="22"/>
+          <w:szCs w:val="22"/>
+        </w:rPr>
+        <w:t>(</w:t>
+      </w:r>
+      <w:proofErr w:type="spellStart"/>
+      <w:r>
+        <w:rPr>
+          <w:sz w:val="22"/>
+          <w:szCs w:val="22"/>
+        </w:rPr>
+        <w:t>userId</w:t>
+      </w:r>
+      <w:proofErr w:type="spellEnd"/>
+      <w:r>
+        <w:rPr>
+          <w:sz w:val="22"/>
+          <w:szCs w:val="22"/>
+        </w:rPr>
+        <w:t xml:space="preserve">) que consulte la tabla </w:t>
+      </w:r>
+      <w:proofErr w:type="spellStart"/>
+      <w:r>
+        <w:rPr>
+          <w:sz w:val="22"/>
+          <w:szCs w:val="22"/>
+        </w:rPr>
+        <w:t>profiles</w:t>
+      </w:r>
+      <w:proofErr w:type="spellEnd"/>
+      <w:r>
+        <w:rPr>
+          <w:sz w:val="22"/>
+          <w:szCs w:val="22"/>
+        </w:rPr>
+        <w:t xml:space="preserve"> mediante </w:t>
+      </w:r>
+      <w:proofErr w:type="spellStart"/>
+      <w:proofErr w:type="gramStart"/>
+      <w:r>
+        <w:rPr>
+          <w:sz w:val="22"/>
+          <w:szCs w:val="22"/>
+        </w:rPr>
+        <w:t>window.NikaSupabase.client</w:t>
+      </w:r>
+      <w:proofErr w:type="spellEnd"/>
+      <w:proofErr w:type="gramEnd"/>
+      <w:r>
+        <w:rPr>
+          <w:sz w:val="22"/>
+          <w:szCs w:val="22"/>
+        </w:rPr>
+        <w:t xml:space="preserve"> y exponerla en </w:t>
+      </w:r>
+      <w:proofErr w:type="spellStart"/>
+      <w:r>
+        <w:rPr>
+          <w:sz w:val="22"/>
+          <w:szCs w:val="22"/>
+        </w:rPr>
+        <w:t>Object.assign</w:t>
+      </w:r>
+      <w:proofErr w:type="spellEnd"/>
+      <w:r>
+        <w:rPr>
+          <w:sz w:val="22"/>
+          <w:szCs w:val="22"/>
+        </w:rPr>
+        <w:t>(</w:t>
+      </w:r>
+      <w:proofErr w:type="spellStart"/>
+      <w:r>
+        <w:rPr>
+          <w:sz w:val="22"/>
+          <w:szCs w:val="22"/>
+        </w:rPr>
+        <w:t>window</w:t>
+      </w:r>
+      <w:proofErr w:type="spellEnd"/>
+      <w:r>
+        <w:rPr>
+          <w:sz w:val="22"/>
+          <w:szCs w:val="22"/>
+        </w:rPr>
+        <w:t>, {...}).</w:t>
+      </w:r>
+    </w:p>
+    <w:p>
+      <w:pPr>
+        <w:numPr>
+          <w:ilvl w:val="0"/>
+          <w:numId w:val="24"/>
+        </w:numPr>
+        <w:jc w:val="both"/>
+        <w:rPr>
+          <w:sz w:val="22"/>
+          <w:szCs w:val="22"/>
+        </w:rPr>
+      </w:pPr>
+      <w:r>
+        <w:rPr>
+          <w:sz w:val="22"/>
+          <w:szCs w:val="22"/>
+        </w:rPr>
+        <w:t>Inyección en UI: Sumar el botón "</w:t>
+      </w:r>
+      <w:r>
+        <w:rPr>
+          <w:rFonts w:ascii="Segoe UI Symbol" w:hAnsi="Segoe UI Symbol" w:cs="Segoe UI Symbol"/>
+          <w:sz w:val="22"/>
+          <w:szCs w:val="22"/>
+        </w:rPr>
+        <w:t>👁</w:t>
+      </w:r>
+      <w:r>
+        <w:rPr>
+          <w:sz w:val="22"/>
+          <w:szCs w:val="22"/>
+        </w:rPr>
+        <w:t>️ Ver Perfil" tanto en las tarjetas del directorio general (</w:t>
+      </w:r>
+      <w:proofErr w:type="spellStart"/>
+      <w:r>
+        <w:rPr>
+          <w:sz w:val="22"/>
+          <w:szCs w:val="22"/>
+        </w:rPr>
+        <w:t>cargarDirectorioUsuarios</w:t>
+      </w:r>
+      <w:proofErr w:type="spellEnd"/>
+      <w:r>
+        <w:rPr>
+          <w:sz w:val="22"/>
+          <w:szCs w:val="22"/>
+        </w:rPr>
+        <w:t>) como en los resultados del buscador por iniciales (</w:t>
+      </w:r>
+      <w:proofErr w:type="spellStart"/>
+      <w:r>
+        <w:rPr>
+          <w:sz w:val="22"/>
+          <w:szCs w:val="22"/>
+        </w:rPr>
+        <w:t>searchUsers</w:t>
+      </w:r>
+      <w:proofErr w:type="spellEnd"/>
+      <w:r>
+        <w:rPr>
+          <w:sz w:val="22"/>
+          <w:szCs w:val="22"/>
+        </w:rPr>
+        <w:t>).</w:t>
+      </w:r>
+    </w:p>
+    <w:p>
+      <w:pPr>
+        <w:jc w:val="both"/>
+        <w:rPr>
+          <w:sz w:val="22"/>
+          <w:szCs w:val="22"/>
+        </w:rPr>
+      </w:pPr>
+      <w:r>
+        <w:rPr>
+          <w:sz w:val="22"/>
+          <w:szCs w:val="22"/>
+        </w:rPr>
+        <w:t>2. Integración del Chat Privado a la UI</w:t>
+      </w:r>
+    </w:p>
+    <w:p>
+      <w:pPr>
+        <w:numPr>
+          <w:ilvl w:val="0"/>
+          <w:numId w:val="25"/>
+        </w:numPr>
+        <w:jc w:val="both"/>
+        <w:rPr>
+          <w:sz w:val="22"/>
+          <w:szCs w:val="22"/>
+        </w:rPr>
+      </w:pPr>
+      <w:r>
+        <w:rPr>
+          <w:sz w:val="22"/>
+          <w:szCs w:val="22"/>
+        </w:rPr>
+        <w:t xml:space="preserve">Carga de script: Incluir &lt;script </w:t>
+      </w:r>
+      <w:proofErr w:type="spellStart"/>
+      <w:r>
+        <w:rPr>
+          <w:sz w:val="22"/>
+          <w:szCs w:val="22"/>
+        </w:rPr>
+        <w:t>src</w:t>
+      </w:r>
+      <w:proofErr w:type="spellEnd"/>
+      <w:r>
+        <w:rPr>
+          <w:sz w:val="22"/>
+          <w:szCs w:val="22"/>
+        </w:rPr>
+        <w:t>="</w:t>
+      </w:r>
+      <w:proofErr w:type="spellStart"/>
+      <w:r>
+        <w:rPr>
+          <w:sz w:val="22"/>
+          <w:szCs w:val="22"/>
+        </w:rPr>
+        <w:t>js</w:t>
+      </w:r>
+      <w:proofErr w:type="spellEnd"/>
+      <w:r>
+        <w:rPr>
+          <w:sz w:val="22"/>
+          <w:szCs w:val="22"/>
+        </w:rPr>
+        <w:t>/chatManager.js"&gt;&lt;/script&gt; en campus.html.</w:t>
+      </w:r>
+    </w:p>
+    <w:p>
+      <w:pPr>
+        <w:numPr>
+          <w:ilvl w:val="0"/>
+          <w:numId w:val="25"/>
+        </w:numPr>
+        <w:jc w:val="both"/>
+        <w:rPr>
+          <w:sz w:val="22"/>
+          <w:szCs w:val="22"/>
+        </w:rPr>
+      </w:pPr>
+      <w:r>
+        <w:rPr>
+          <w:sz w:val="22"/>
+          <w:szCs w:val="22"/>
+        </w:rPr>
+        <w:t>Apertura de conversación: Agregar el botón de chat junto a cada amigo en la lista de amigos (</w:t>
+      </w:r>
+      <w:proofErr w:type="spellStart"/>
+      <w:proofErr w:type="gramStart"/>
+      <w:r>
+        <w:rPr>
+          <w:sz w:val="22"/>
+          <w:szCs w:val="22"/>
+        </w:rPr>
+        <w:t>renderFriendsList</w:t>
+      </w:r>
+      <w:proofErr w:type="spellEnd"/>
+      <w:r>
+        <w:rPr>
+          <w:sz w:val="22"/>
+          <w:szCs w:val="22"/>
+        </w:rPr>
+        <w:t>(</w:t>
+      </w:r>
+      <w:proofErr w:type="gramEnd"/>
+      <w:r>
+        <w:rPr>
+          <w:sz w:val="22"/>
+          <w:szCs w:val="22"/>
+        </w:rPr>
+        <w:t>)) para desplegar la ventana de mensajes directos.</w:t>
+      </w:r>
+    </w:p>
+    <w:p>
+      <w:pPr>
+        <w:numPr>
+          <w:ilvl w:val="0"/>
+          <w:numId w:val="25"/>
+        </w:numPr>
+        <w:jc w:val="both"/>
+        <w:rPr>
+          <w:sz w:val="22"/>
+          <w:szCs w:val="22"/>
+        </w:rPr>
+      </w:pPr>
+      <w:r>
+        <w:rPr>
+          <w:sz w:val="22"/>
+          <w:szCs w:val="22"/>
+        </w:rPr>
+        <w:t xml:space="preserve">Compartir pregunta: Agregar el botón </w:t>
+      </w:r>
+      <w:r>
+        <w:rPr>
+          <w:i/>
+          <w:iCs/>
+          <w:sz w:val="22"/>
+          <w:szCs w:val="22"/>
+        </w:rPr>
+        <w:t>"</w:t>
+      </w:r>
+      <w:r>
+        <w:rPr>
+          <w:rFonts w:ascii="Segoe UI Emoji" w:hAnsi="Segoe UI Emoji" w:cs="Segoe UI Emoji"/>
+          <w:i/>
+          <w:iCs/>
+          <w:sz w:val="22"/>
+          <w:szCs w:val="22"/>
+        </w:rPr>
+        <w:t>💬</w:t>
+      </w:r>
+      <w:r>
+        <w:rPr>
+          <w:i/>
+          <w:iCs/>
+          <w:sz w:val="22"/>
+          <w:szCs w:val="22"/>
+        </w:rPr>
+        <w:t xml:space="preserve"> Compartir al chat"</w:t>
+      </w:r>
+      <w:r>
+        <w:rPr>
+          <w:sz w:val="22"/>
+          <w:szCs w:val="22"/>
+        </w:rPr>
+        <w:t xml:space="preserve"> junto a cada pregunta en examen.html para que el estudiante pueda enviar un caso clínico a un amigo seleccionado.</w:t>
+      </w:r>
+    </w:p>
+    <w:p>
+      <w:pPr>
+        <w:numPr>
+          <w:ilvl w:val="0"/>
+          <w:numId w:val="25"/>
+        </w:numPr>
+        <w:jc w:val="both"/>
+        <w:rPr>
+          <w:sz w:val="22"/>
+          <w:szCs w:val="22"/>
+        </w:rPr>
+      </w:pPr>
+      <w:r>
+        <w:rPr>
+          <w:sz w:val="22"/>
+          <w:szCs w:val="22"/>
+        </w:rPr>
+        <w:t>Renderizado de tarjetas: Mostrar el bloque de pregunta compartida (UP, enunciado y opciones) dentro del hilo de chat.</w:t>
+      </w:r>
+    </w:p>
+    <w:p>
+      <w:pPr>
+        <w:jc w:val="both"/>
+        <w:rPr>
+          <w:sz w:val="22"/>
+          <w:szCs w:val="22"/>
+        </w:rPr>
+      </w:pPr>
+      <w:r>
+        <w:rPr>
+          <w:sz w:val="22"/>
+          <w:szCs w:val="22"/>
+        </w:rPr>
+        <w:t xml:space="preserve">3. Integración del </w:t>
+      </w:r>
+      <w:proofErr w:type="spellStart"/>
+      <w:r>
+        <w:rPr>
+          <w:sz w:val="22"/>
+          <w:szCs w:val="22"/>
+        </w:rPr>
+        <w:t>Pomodoro</w:t>
+      </w:r>
+      <w:proofErr w:type="spellEnd"/>
+      <w:r>
+        <w:rPr>
+          <w:sz w:val="22"/>
+          <w:szCs w:val="22"/>
+        </w:rPr>
+        <w:t xml:space="preserve"> Sincronizado ("Modo Biblioteca")</w:t>
+      </w:r>
+    </w:p>
+    <w:p>
+      <w:pPr>
+        <w:numPr>
+          <w:ilvl w:val="0"/>
+          <w:numId w:val="26"/>
+        </w:numPr>
+        <w:jc w:val="both"/>
+        <w:rPr>
+          <w:sz w:val="22"/>
+          <w:szCs w:val="22"/>
+        </w:rPr>
+      </w:pPr>
+      <w:r>
+        <w:rPr>
+          <w:sz w:val="22"/>
+          <w:szCs w:val="22"/>
+        </w:rPr>
+        <w:t xml:space="preserve">Carga de script: Incluir &lt;script </w:t>
+      </w:r>
+      <w:proofErr w:type="spellStart"/>
+      <w:r>
+        <w:rPr>
+          <w:sz w:val="22"/>
+          <w:szCs w:val="22"/>
+        </w:rPr>
+        <w:t>src</w:t>
+      </w:r>
+      <w:proofErr w:type="spellEnd"/>
+      <w:r>
+        <w:rPr>
+          <w:sz w:val="22"/>
+          <w:szCs w:val="22"/>
+        </w:rPr>
+        <w:t>="</w:t>
+      </w:r>
+      <w:proofErr w:type="spellStart"/>
+      <w:r>
+        <w:rPr>
+          <w:sz w:val="22"/>
+          <w:szCs w:val="22"/>
+        </w:rPr>
+        <w:t>js</w:t>
+      </w:r>
+      <w:proofErr w:type="spellEnd"/>
+      <w:r>
+        <w:rPr>
+          <w:sz w:val="22"/>
+          <w:szCs w:val="22"/>
+        </w:rPr>
+        <w:t>/pomodoroSyncManager.js"&gt;&lt;/script&gt; en campus.html.</w:t>
+      </w:r>
+    </w:p>
+    <w:p>
+      <w:pPr>
+        <w:numPr>
+          <w:ilvl w:val="0"/>
+          <w:numId w:val="26"/>
+        </w:numPr>
+        <w:jc w:val="both"/>
+        <w:rPr>
+          <w:sz w:val="22"/>
+          <w:szCs w:val="22"/>
+        </w:rPr>
+      </w:pPr>
+      <w:r>
+        <w:rPr>
+          <w:sz w:val="22"/>
+          <w:szCs w:val="22"/>
+        </w:rPr>
+        <w:t xml:space="preserve">Estado en tiempo real: Mostrar el estado de estudio de cada amigo conectado (ej. </w:t>
+      </w:r>
+      <w:r>
+        <w:rPr>
+          <w:i/>
+          <w:iCs/>
+          <w:sz w:val="22"/>
+          <w:szCs w:val="22"/>
+        </w:rPr>
+        <w:t xml:space="preserve">"Estudiando UP3 · </w:t>
+      </w:r>
+      <w:proofErr w:type="spellStart"/>
+      <w:r>
+        <w:rPr>
+          <w:i/>
+          <w:iCs/>
+          <w:sz w:val="22"/>
+          <w:szCs w:val="22"/>
+        </w:rPr>
+        <w:t>Pomodoro</w:t>
+      </w:r>
+      <w:proofErr w:type="spellEnd"/>
+      <w:r>
+        <w:rPr>
+          <w:i/>
+          <w:iCs/>
+          <w:sz w:val="22"/>
+          <w:szCs w:val="22"/>
+        </w:rPr>
+        <w:t xml:space="preserve"> activo"</w:t>
+      </w:r>
+      <w:r>
+        <w:rPr>
+          <w:sz w:val="22"/>
+          <w:szCs w:val="22"/>
+        </w:rPr>
+        <w:t xml:space="preserve">) en el widget de comunidad usando </w:t>
+      </w:r>
+      <w:proofErr w:type="spellStart"/>
+      <w:r>
+        <w:rPr>
+          <w:sz w:val="22"/>
+          <w:szCs w:val="22"/>
+        </w:rPr>
+        <w:t>Supabase</w:t>
+      </w:r>
+      <w:proofErr w:type="spellEnd"/>
+      <w:r>
+        <w:rPr>
+          <w:sz w:val="22"/>
+          <w:szCs w:val="22"/>
+        </w:rPr>
+        <w:t xml:space="preserve"> </w:t>
+      </w:r>
+      <w:proofErr w:type="spellStart"/>
+      <w:r>
+        <w:rPr>
+          <w:sz w:val="22"/>
+          <w:szCs w:val="22"/>
+        </w:rPr>
+        <w:t>Presence</w:t>
+      </w:r>
+      <w:proofErr w:type="spellEnd"/>
+      <w:r>
+        <w:rPr>
+          <w:sz w:val="22"/>
+          <w:szCs w:val="22"/>
+        </w:rPr>
+        <w:t>.</w:t>
+      </w:r>
+    </w:p>
+    <w:p>
+      <w:pPr>
+        <w:numPr>
+          <w:ilvl w:val="0"/>
+          <w:numId w:val="26"/>
+        </w:numPr>
+        <w:jc w:val="both"/>
+        <w:rPr>
+          <w:sz w:val="22"/>
+          <w:szCs w:val="22"/>
+        </w:rPr>
+      </w:pPr>
+      <w:r>
+        <w:rPr>
+          <w:sz w:val="22"/>
+          <w:szCs w:val="22"/>
+        </w:rPr>
+        <w:t xml:space="preserve">Botón interactivo: Agregar el botón </w:t>
+      </w:r>
+      <w:r>
+        <w:rPr>
+          <w:i/>
+          <w:iCs/>
+          <w:sz w:val="22"/>
+          <w:szCs w:val="22"/>
+        </w:rPr>
+        <w:t xml:space="preserve">"Unirme al </w:t>
+      </w:r>
+      <w:proofErr w:type="spellStart"/>
+      <w:r>
+        <w:rPr>
+          <w:i/>
+          <w:iCs/>
+          <w:sz w:val="22"/>
+          <w:szCs w:val="22"/>
+        </w:rPr>
+        <w:t>Pomodoro</w:t>
+      </w:r>
+      <w:proofErr w:type="spellEnd"/>
+      <w:r>
+        <w:rPr>
+          <w:i/>
+          <w:iCs/>
+          <w:sz w:val="22"/>
+          <w:szCs w:val="22"/>
+        </w:rPr>
+        <w:t>"</w:t>
+      </w:r>
+      <w:r>
+        <w:rPr>
+          <w:sz w:val="22"/>
+          <w:szCs w:val="22"/>
+        </w:rPr>
+        <w:t xml:space="preserve"> para sincronizar automáticamente el temporizador con el colega.</w:t>
+      </w:r>
+    </w:p>
+    <w:p>
+      <w:pPr>
+        <w:jc w:val="both"/>
+        <w:rPr>
+          <w:sz w:val="22"/>
+          <w:szCs w:val="22"/>
+        </w:rPr>
+      </w:pPr>
+      <w:r>
+        <w:rPr>
+          <w:sz w:val="22"/>
+          <w:szCs w:val="22"/>
+        </w:rPr>
+        <w:t>4. Dinamización de la Tarjeta "</w:t>
+      </w:r>
+      <w:proofErr w:type="spellStart"/>
+      <w:r>
+        <w:rPr>
+          <w:sz w:val="22"/>
+          <w:szCs w:val="22"/>
+        </w:rPr>
+        <w:t>Continuá</w:t>
+      </w:r>
+      <w:proofErr w:type="spellEnd"/>
+      <w:r>
+        <w:rPr>
+          <w:sz w:val="22"/>
+          <w:szCs w:val="22"/>
+        </w:rPr>
+        <w:t xml:space="preserve"> donde lo dejaste"</w:t>
+      </w:r>
+    </w:p>
+    <w:p>
+      <w:pPr>
+        <w:numPr>
+          <w:ilvl w:val="0"/>
+          <w:numId w:val="27"/>
+        </w:numPr>
+        <w:jc w:val="both"/>
+        <w:rPr>
+          <w:sz w:val="22"/>
+          <w:szCs w:val="22"/>
+        </w:rPr>
+      </w:pPr>
+      <w:r>
+        <w:rPr>
+          <w:sz w:val="22"/>
+          <w:szCs w:val="22"/>
+        </w:rPr>
+        <w:t xml:space="preserve">Limpieza de </w:t>
+      </w:r>
+      <w:proofErr w:type="spellStart"/>
+      <w:r>
+        <w:rPr>
+          <w:sz w:val="22"/>
+          <w:szCs w:val="22"/>
+        </w:rPr>
+        <w:t>hardcodeo</w:t>
+      </w:r>
+      <w:proofErr w:type="spellEnd"/>
+      <w:r>
+        <w:rPr>
+          <w:sz w:val="22"/>
+          <w:szCs w:val="22"/>
+        </w:rPr>
+        <w:t>: Quitar del HTML de campus.html los textos estáticos ("Cirugía · UP3") y la barra fija al "82%".</w:t>
+      </w:r>
+    </w:p>
+    <w:p>
+      <w:pPr>
+        <w:numPr>
+          <w:ilvl w:val="0"/>
+          <w:numId w:val="27"/>
+        </w:numPr>
+        <w:jc w:val="both"/>
+        <w:rPr>
+          <w:sz w:val="22"/>
+          <w:szCs w:val="22"/>
+        </w:rPr>
+      </w:pPr>
+      <w:r>
+        <w:rPr>
+          <w:sz w:val="22"/>
+          <w:szCs w:val="22"/>
+        </w:rPr>
+        <w:t xml:space="preserve">Lectura real: Ajustar </w:t>
+      </w:r>
+      <w:proofErr w:type="spellStart"/>
+      <w:proofErr w:type="gramStart"/>
+      <w:r>
+        <w:rPr>
+          <w:sz w:val="22"/>
+          <w:szCs w:val="22"/>
+        </w:rPr>
+        <w:t>syncStudyProgress</w:t>
+      </w:r>
+      <w:proofErr w:type="spellEnd"/>
+      <w:r>
+        <w:rPr>
+          <w:sz w:val="22"/>
+          <w:szCs w:val="22"/>
+        </w:rPr>
+        <w:t>(</w:t>
+      </w:r>
+      <w:proofErr w:type="gramEnd"/>
+      <w:r>
+        <w:rPr>
+          <w:sz w:val="22"/>
+          <w:szCs w:val="22"/>
+        </w:rPr>
+        <w:t xml:space="preserve">) para que lea los </w:t>
+      </w:r>
+      <w:proofErr w:type="spellStart"/>
+      <w:r>
+        <w:rPr>
+          <w:sz w:val="22"/>
+          <w:szCs w:val="22"/>
+        </w:rPr>
+        <w:t>checklists</w:t>
+      </w:r>
+      <w:proofErr w:type="spellEnd"/>
+      <w:r>
+        <w:rPr>
+          <w:sz w:val="22"/>
+          <w:szCs w:val="22"/>
+        </w:rPr>
+        <w:t xml:space="preserve"> de contenidos de las áreas clínicas, determine cuál fue la última Unidad Problema trabajada y pinte el porcentaje real de avance.</w:t>
+      </w:r>
+    </w:p>
+    <w:p>
+      <w:pPr>
+        <w:jc w:val="both"/>
+        <w:rPr>
+          <w:sz w:val="22"/>
+          <w:szCs w:val="22"/>
+        </w:rPr>
+      </w:pPr>
+      <w:r>
+        <w:rPr>
+          <w:sz w:val="22"/>
+          <w:szCs w:val="22"/>
+        </w:rPr>
+        <w:t>5. Revisión y Ajustes del Modo Versus 1vs1</w:t>
+      </w:r>
+    </w:p>
+    <w:p>
+      <w:pPr>
+        <w:numPr>
+          <w:ilvl w:val="0"/>
+          <w:numId w:val="28"/>
+        </w:numPr>
+        <w:jc w:val="both"/>
+        <w:rPr>
+          <w:sz w:val="22"/>
+          <w:szCs w:val="22"/>
+        </w:rPr>
+      </w:pPr>
+      <w:r>
+        <w:rPr>
+          <w:sz w:val="22"/>
+          <w:szCs w:val="22"/>
+        </w:rPr>
+        <w:t>Corrección de columnas en duelosManager.js y versus.html: Cambiar referencias viejas (</w:t>
+      </w:r>
+      <w:proofErr w:type="spellStart"/>
+      <w:r>
+        <w:rPr>
+          <w:sz w:val="22"/>
+          <w:szCs w:val="22"/>
+        </w:rPr>
+        <w:t>full_name</w:t>
+      </w:r>
+      <w:proofErr w:type="spellEnd"/>
+      <w:r>
+        <w:rPr>
+          <w:sz w:val="22"/>
+          <w:szCs w:val="22"/>
+        </w:rPr>
+        <w:t xml:space="preserve"> y </w:t>
+      </w:r>
+      <w:proofErr w:type="spellStart"/>
+      <w:r>
+        <w:rPr>
+          <w:sz w:val="22"/>
+          <w:szCs w:val="22"/>
+        </w:rPr>
+        <w:t>avatar_url</w:t>
+      </w:r>
+      <w:proofErr w:type="spellEnd"/>
+      <w:r>
+        <w:rPr>
+          <w:sz w:val="22"/>
+          <w:szCs w:val="22"/>
+        </w:rPr>
+        <w:t>) a las columnas reales de la base de datos (</w:t>
+      </w:r>
+      <w:proofErr w:type="spellStart"/>
+      <w:r>
+        <w:rPr>
+          <w:sz w:val="22"/>
+          <w:szCs w:val="22"/>
+        </w:rPr>
+        <w:t>fullname</w:t>
+      </w:r>
+      <w:proofErr w:type="spellEnd"/>
+      <w:r>
+        <w:rPr>
+          <w:sz w:val="22"/>
+          <w:szCs w:val="22"/>
+        </w:rPr>
+        <w:t xml:space="preserve"> y avatar).</w:t>
+      </w:r>
+    </w:p>
+    <w:p>
+      <w:pPr>
+        <w:numPr>
+          <w:ilvl w:val="0"/>
+          <w:numId w:val="28"/>
+        </w:numPr>
+        <w:jc w:val="both"/>
+        <w:rPr>
+          <w:sz w:val="22"/>
+          <w:szCs w:val="22"/>
+        </w:rPr>
+      </w:pPr>
+      <w:proofErr w:type="spellStart"/>
+      <w:r>
+        <w:rPr>
+          <w:sz w:val="22"/>
+          <w:szCs w:val="22"/>
+        </w:rPr>
+        <w:t>Auth</w:t>
+      </w:r>
+      <w:proofErr w:type="spellEnd"/>
+      <w:r>
+        <w:rPr>
+          <w:sz w:val="22"/>
+          <w:szCs w:val="22"/>
+        </w:rPr>
+        <w:t xml:space="preserve"> </w:t>
+      </w:r>
+      <w:proofErr w:type="spellStart"/>
+      <w:r>
+        <w:rPr>
+          <w:sz w:val="22"/>
+          <w:szCs w:val="22"/>
+        </w:rPr>
+        <w:t>Guard</w:t>
+      </w:r>
+      <w:proofErr w:type="spellEnd"/>
+      <w:r>
+        <w:rPr>
+          <w:sz w:val="22"/>
+          <w:szCs w:val="22"/>
+        </w:rPr>
+        <w:t xml:space="preserve"> en versus.html: Asegurar la llamada a </w:t>
+      </w:r>
+      <w:proofErr w:type="spellStart"/>
+      <w:proofErr w:type="gramStart"/>
+      <w:r>
+        <w:rPr>
+          <w:sz w:val="22"/>
+          <w:szCs w:val="22"/>
+        </w:rPr>
+        <w:t>window.NikaSupabase.restaurarSesionSiExiste</w:t>
+      </w:r>
+      <w:proofErr w:type="spellEnd"/>
+      <w:proofErr w:type="gramEnd"/>
+      <w:r>
+        <w:rPr>
+          <w:sz w:val="22"/>
+          <w:szCs w:val="22"/>
+        </w:rPr>
+        <w:t xml:space="preserve">() al inicio para evitar que </w:t>
+      </w:r>
+      <w:proofErr w:type="spellStart"/>
+      <w:r>
+        <w:rPr>
+          <w:sz w:val="22"/>
+          <w:szCs w:val="22"/>
+        </w:rPr>
+        <w:t>desloguee</w:t>
+      </w:r>
+      <w:proofErr w:type="spellEnd"/>
+      <w:r>
+        <w:rPr>
+          <w:sz w:val="22"/>
+          <w:szCs w:val="22"/>
+        </w:rPr>
+        <w:t xml:space="preserve"> a los jugadores al ingresar a un duelo.</w:t>
+      </w:r>
+    </w:p>
+    <w:p>
+      <w:pPr>
+        <w:numPr>
+          <w:ilvl w:val="0"/>
+          <w:numId w:val="28"/>
+        </w:numPr>
+        <w:jc w:val="both"/>
+        <w:rPr>
+          <w:sz w:val="22"/>
+          <w:szCs w:val="22"/>
+        </w:rPr>
+      </w:pPr>
+      <w:proofErr w:type="spellStart"/>
+      <w:r>
+        <w:rPr>
+          <w:sz w:val="22"/>
+          <w:szCs w:val="22"/>
+        </w:rPr>
+        <w:lastRenderedPageBreak/>
+        <w:t>Layout</w:t>
+      </w:r>
+      <w:proofErr w:type="spellEnd"/>
+      <w:r>
+        <w:rPr>
+          <w:sz w:val="22"/>
+          <w:szCs w:val="22"/>
+        </w:rPr>
+        <w:t xml:space="preserve"> </w:t>
+      </w:r>
+      <w:proofErr w:type="spellStart"/>
+      <w:r>
+        <w:rPr>
+          <w:sz w:val="22"/>
+          <w:szCs w:val="22"/>
+        </w:rPr>
+        <w:t>mobile</w:t>
+      </w:r>
+      <w:proofErr w:type="spellEnd"/>
+      <w:r>
+        <w:rPr>
+          <w:sz w:val="22"/>
+          <w:szCs w:val="22"/>
+        </w:rPr>
+        <w:t xml:space="preserve"> en versus.html: Agregar @media </w:t>
+      </w:r>
+      <w:proofErr w:type="spellStart"/>
+      <w:r>
+        <w:rPr>
+          <w:sz w:val="22"/>
+          <w:szCs w:val="22"/>
+        </w:rPr>
+        <w:t>queries</w:t>
+      </w:r>
+      <w:proofErr w:type="spellEnd"/>
+      <w:r>
+        <w:rPr>
+          <w:sz w:val="22"/>
+          <w:szCs w:val="22"/>
+        </w:rPr>
+        <w:t xml:space="preserve"> y </w:t>
+      </w:r>
+      <w:proofErr w:type="spellStart"/>
+      <w:r>
+        <w:rPr>
+          <w:sz w:val="22"/>
+          <w:szCs w:val="22"/>
+        </w:rPr>
+        <w:t>padding</w:t>
+      </w:r>
+      <w:proofErr w:type="spellEnd"/>
+      <w:r>
+        <w:rPr>
+          <w:sz w:val="22"/>
+          <w:szCs w:val="22"/>
+        </w:rPr>
+        <w:t xml:space="preserve"> superior para que el </w:t>
+      </w:r>
+      <w:proofErr w:type="spellStart"/>
+      <w:r>
+        <w:rPr>
+          <w:sz w:val="22"/>
+          <w:szCs w:val="22"/>
+        </w:rPr>
+        <w:t>navbar</w:t>
+      </w:r>
+      <w:proofErr w:type="spellEnd"/>
+      <w:r>
+        <w:rPr>
+          <w:sz w:val="22"/>
+          <w:szCs w:val="22"/>
+        </w:rPr>
+        <w:t>/</w:t>
+      </w:r>
+      <w:proofErr w:type="spellStart"/>
+      <w:r>
+        <w:rPr>
+          <w:sz w:val="22"/>
+          <w:szCs w:val="22"/>
+        </w:rPr>
+        <w:t>header</w:t>
+      </w:r>
+      <w:proofErr w:type="spellEnd"/>
+      <w:r>
+        <w:rPr>
+          <w:sz w:val="22"/>
+          <w:szCs w:val="22"/>
+        </w:rPr>
+        <w:t xml:space="preserve"> fijo no tape las preguntas ni las opciones de respuesta en celulares.</w:t>
+      </w:r>
+    </w:p>
+    <w:p>
+      <w:pPr>
+        <w:numPr>
+          <w:ilvl w:val="0"/>
+          <w:numId w:val="28"/>
+        </w:numPr>
+        <w:jc w:val="both"/>
+        <w:rPr>
+          <w:sz w:val="22"/>
+          <w:szCs w:val="22"/>
+        </w:rPr>
+      </w:pPr>
+      <w:r>
+        <w:rPr>
+          <w:sz w:val="22"/>
+          <w:szCs w:val="22"/>
+        </w:rPr>
+        <w:t xml:space="preserve">Sincronización del lobby: Confirmar que ambos oponentes se suscriban correctamente al canal de </w:t>
+      </w:r>
+      <w:proofErr w:type="spellStart"/>
+      <w:r>
+        <w:rPr>
+          <w:sz w:val="22"/>
+          <w:szCs w:val="22"/>
+        </w:rPr>
+        <w:t>Supabase</w:t>
+      </w:r>
+      <w:proofErr w:type="spellEnd"/>
+      <w:r>
+        <w:rPr>
+          <w:sz w:val="22"/>
+          <w:szCs w:val="22"/>
+        </w:rPr>
+        <w:t xml:space="preserve"> </w:t>
+      </w:r>
+      <w:proofErr w:type="spellStart"/>
+      <w:r>
+        <w:rPr>
+          <w:sz w:val="22"/>
+          <w:szCs w:val="22"/>
+        </w:rPr>
+        <w:t>Realtime</w:t>
+      </w:r>
+      <w:proofErr w:type="spellEnd"/>
+      <w:r>
+        <w:rPr>
+          <w:sz w:val="22"/>
+          <w:szCs w:val="22"/>
+        </w:rPr>
+        <w:t xml:space="preserve"> con las mismas preguntas cargadas tras aceptar el reto.</w:t>
+      </w:r>
+    </w:p>
+    <w:p>
+      <w:pPr>
+        <w:jc w:val="both"/>
+        <w:rPr>
+          <w:sz w:val="22"/>
+          <w:szCs w:val="22"/>
+        </w:rPr>
+      </w:pPr>
+    </w:p>
+    <w:p>
+      <w:pPr>
+        <w:jc w:val="both"/>
+        <w:rPr>
+          <w:b/>
+          <w:bCs/>
+          <w:sz w:val="22"/>
+          <w:szCs w:val="22"/>
+        </w:rPr>
+      </w:pPr>
+    </w:p>
+    <w:p>
+      <w:pPr>
+        <w:jc w:val="both"/>
+        <w:rPr>
+          <w:b/>
+          <w:bCs/>
+          <w:sz w:val="22"/>
+          <w:szCs w:val="22"/>
+        </w:rPr>
+      </w:pPr>
+    </w:p>
+    <w:p>
+      <w:pPr>
+        <w:jc w:val="both"/>
+        <w:rPr>
+          <w:b/>
+          <w:bCs/>
+          <w:sz w:val="22"/>
+          <w:szCs w:val="22"/>
+        </w:rPr>
+      </w:pPr>
+    </w:p>
+    <w:p>
+      <w:pPr>
+        <w:jc w:val="both"/>
+        <w:rPr>
+          <w:b/>
+          <w:bCs/>
+          <w:sz w:val="22"/>
+          <w:szCs w:val="22"/>
+        </w:rPr>
+      </w:pPr>
+    </w:p>
+    <w:p>
+      <w:pPr>
+        <w:jc w:val="both"/>
+        <w:rPr>
+          <w:b/>
+          <w:bCs/>
+          <w:sz w:val="22"/>
+          <w:szCs w:val="22"/>
+        </w:rPr>
+      </w:pPr>
       <w:r>
         <w:rPr>
           <w:b/>
@@ -16160,7 +17604,6 @@
           <w:sz w:val="22"/>
           <w:szCs w:val="22"/>
         </w:rPr>
-        <w:lastRenderedPageBreak/>
         <w:t>4. Criterios de Éxito y Auditoría Final</w:t>
       </w:r>
     </w:p>
@@ -17128,6 +18571,155 @@
     </w:lvl>
   </w:abstractNum>
   <w:abstractNum w:abstractNumId="1" w15:restartNumberingAfterBreak="0">
+    <w:nsid w:val="08F13B8F"/>
+    <w:multiLevelType w:val="multilevel"/>
+    <w:tmpl w:val="46C8E504"/>
+    <w:lvl w:ilvl="0">
+      <w:start w:val="1"/>
+      <w:numFmt w:val="bullet"/>
+      <w:lvlText w:val=""/>
+      <w:lvlJc w:val="left"/>
+      <w:pPr>
+        <w:tabs>
+          <w:tab w:val="num" w:pos="720"/>
+        </w:tabs>
+        <w:ind w:left="720" w:hanging="360"/>
+      </w:pPr>
+      <w:rPr>
+        <w:rFonts w:ascii="Symbol" w:hAnsi="Symbol" w:hint="default"/>
+        <w:sz w:val="20"/>
+      </w:rPr>
+    </w:lvl>
+    <w:lvl w:ilvl="1" w:tentative="1">
+      <w:start w:val="1"/>
+      <w:numFmt w:val="bullet"/>
+      <w:lvlText w:val="o"/>
+      <w:lvlJc w:val="left"/>
+      <w:pPr>
+        <w:tabs>
+          <w:tab w:val="num" w:pos="1440"/>
+        </w:tabs>
+        <w:ind w:left="1440" w:hanging="360"/>
+      </w:pPr>
+      <w:rPr>
+        <w:rFonts w:ascii="Courier New" w:hAnsi="Courier New" w:hint="default"/>
+        <w:sz w:val="20"/>
+      </w:rPr>
+    </w:lvl>
+    <w:lvl w:ilvl="2" w:tentative="1">
+      <w:start w:val="1"/>
+      <w:numFmt w:val="bullet"/>
+      <w:lvlText w:val=""/>
+      <w:lvlJc w:val="left"/>
+      <w:pPr>
+        <w:tabs>
+          <w:tab w:val="num" w:pos="2160"/>
+        </w:tabs>
+        <w:ind w:left="2160" w:hanging="360"/>
+      </w:pPr>
+      <w:rPr>
+        <w:rFonts w:ascii="Wingdings" w:hAnsi="Wingdings" w:hint="default"/>
+        <w:sz w:val="20"/>
+      </w:rPr>
+    </w:lvl>
+    <w:lvl w:ilvl="3" w:tentative="1">
+      <w:start w:val="1"/>
+      <w:numFmt w:val="bullet"/>
+      <w:lvlText w:val=""/>
+      <w:lvlJc w:val="left"/>
+      <w:pPr>
+        <w:tabs>
+          <w:tab w:val="num" w:pos="2880"/>
+        </w:tabs>
+        <w:ind w:left="2880" w:hanging="360"/>
+      </w:pPr>
+      <w:rPr>
+        <w:rFonts w:ascii="Wingdings" w:hAnsi="Wingdings" w:hint="default"/>
+        <w:sz w:val="20"/>
+      </w:rPr>
+    </w:lvl>
+    <w:lvl w:ilvl="4" w:tentative="1">
+      <w:start w:val="1"/>
+      <w:numFmt w:val="bullet"/>
+      <w:lvlText w:val=""/>
+      <w:lvlJc w:val="left"/>
+      <w:pPr>
+        <w:tabs>
+          <w:tab w:val="num" w:pos="3600"/>
+        </w:tabs>
+        <w:ind w:left="3600" w:hanging="360"/>
+      </w:pPr>
+      <w:rPr>
+        <w:rFonts w:ascii="Wingdings" w:hAnsi="Wingdings" w:hint="default"/>
+        <w:sz w:val="20"/>
+      </w:rPr>
+    </w:lvl>
+    <w:lvl w:ilvl="5" w:tentative="1">
+      <w:start w:val="1"/>
+      <w:numFmt w:val="bullet"/>
+      <w:lvlText w:val=""/>
+      <w:lvlJc w:val="left"/>
+      <w:pPr>
+        <w:tabs>
+          <w:tab w:val="num" w:pos="4320"/>
+        </w:tabs>
+        <w:ind w:left="4320" w:hanging="360"/>
+      </w:pPr>
+      <w:rPr>
+        <w:rFonts w:ascii="Wingdings" w:hAnsi="Wingdings" w:hint="default"/>
+        <w:sz w:val="20"/>
+      </w:rPr>
+    </w:lvl>
+    <w:lvl w:ilvl="6" w:tentative="1">
+      <w:start w:val="1"/>
+      <w:numFmt w:val="bullet"/>
+      <w:lvlText w:val=""/>
+      <w:lvlJc w:val="left"/>
+      <w:pPr>
+        <w:tabs>
+          <w:tab w:val="num" w:pos="5040"/>
+        </w:tabs>
+        <w:ind w:left="5040" w:hanging="360"/>
+      </w:pPr>
+      <w:rPr>
+        <w:rFonts w:ascii="Wingdings" w:hAnsi="Wingdings" w:hint="default"/>
+        <w:sz w:val="20"/>
+      </w:rPr>
+    </w:lvl>
+    <w:lvl w:ilvl="7" w:tentative="1">
+      <w:start w:val="1"/>
+      <w:numFmt w:val="bullet"/>
+      <w:lvlText w:val=""/>
+      <w:lvlJc w:val="left"/>
+      <w:pPr>
+        <w:tabs>
+          <w:tab w:val="num" w:pos="5760"/>
+        </w:tabs>
+        <w:ind w:left="5760" w:hanging="360"/>
+      </w:pPr>
+      <w:rPr>
+        <w:rFonts w:ascii="Wingdings" w:hAnsi="Wingdings" w:hint="default"/>
+        <w:sz w:val="20"/>
+      </w:rPr>
+    </w:lvl>
+    <w:lvl w:ilvl="8" w:tentative="1">
+      <w:start w:val="1"/>
+      <w:numFmt w:val="bullet"/>
+      <w:lvlText w:val=""/>
+      <w:lvlJc w:val="left"/>
+      <w:pPr>
+        <w:tabs>
+          <w:tab w:val="num" w:pos="6480"/>
+        </w:tabs>
+        <w:ind w:left="6480" w:hanging="360"/>
+      </w:pPr>
+      <w:rPr>
+        <w:rFonts w:ascii="Wingdings" w:hAnsi="Wingdings" w:hint="default"/>
+        <w:sz w:val="20"/>
+      </w:rPr>
+    </w:lvl>
+  </w:abstractNum>
+  <w:abstractNum w:abstractNumId="2" w15:restartNumberingAfterBreak="0">
     <w:nsid w:val="0EB27902"/>
     <w:multiLevelType w:val="multilevel"/>
     <w:tmpl w:val="2C54F8B0"/>
@@ -17244,7 +18836,7 @@
       </w:pPr>
     </w:lvl>
   </w:abstractNum>
-  <w:abstractNum w:abstractNumId="2" w15:restartNumberingAfterBreak="0">
+  <w:abstractNum w:abstractNumId="3" w15:restartNumberingAfterBreak="0">
     <w:nsid w:val="11077673"/>
     <w:multiLevelType w:val="multilevel"/>
     <w:tmpl w:val="CCB23CCA"/>
@@ -17361,7 +18953,7 @@
       </w:pPr>
     </w:lvl>
   </w:abstractNum>
-  <w:abstractNum w:abstractNumId="3" w15:restartNumberingAfterBreak="0">
+  <w:abstractNum w:abstractNumId="4" w15:restartNumberingAfterBreak="0">
     <w:nsid w:val="11F35902"/>
     <w:multiLevelType w:val="multilevel"/>
     <w:tmpl w:val="EBCEE604"/>
@@ -17506,7 +19098,156 @@
       </w:rPr>
     </w:lvl>
   </w:abstractNum>
-  <w:abstractNum w:abstractNumId="4" w15:restartNumberingAfterBreak="0">
+  <w:abstractNum w:abstractNumId="5" w15:restartNumberingAfterBreak="0">
+    <w:nsid w:val="12951BC4"/>
+    <w:multiLevelType w:val="multilevel"/>
+    <w:tmpl w:val="C84A3D22"/>
+    <w:lvl w:ilvl="0">
+      <w:start w:val="1"/>
+      <w:numFmt w:val="bullet"/>
+      <w:lvlText w:val=""/>
+      <w:lvlJc w:val="left"/>
+      <w:pPr>
+        <w:tabs>
+          <w:tab w:val="num" w:pos="720"/>
+        </w:tabs>
+        <w:ind w:left="720" w:hanging="360"/>
+      </w:pPr>
+      <w:rPr>
+        <w:rFonts w:ascii="Symbol" w:hAnsi="Symbol" w:hint="default"/>
+        <w:sz w:val="20"/>
+      </w:rPr>
+    </w:lvl>
+    <w:lvl w:ilvl="1" w:tentative="1">
+      <w:start w:val="1"/>
+      <w:numFmt w:val="bullet"/>
+      <w:lvlText w:val="o"/>
+      <w:lvlJc w:val="left"/>
+      <w:pPr>
+        <w:tabs>
+          <w:tab w:val="num" w:pos="1440"/>
+        </w:tabs>
+        <w:ind w:left="1440" w:hanging="360"/>
+      </w:pPr>
+      <w:rPr>
+        <w:rFonts w:ascii="Courier New" w:hAnsi="Courier New" w:hint="default"/>
+        <w:sz w:val="20"/>
+      </w:rPr>
+    </w:lvl>
+    <w:lvl w:ilvl="2" w:tentative="1">
+      <w:start w:val="1"/>
+      <w:numFmt w:val="bullet"/>
+      <w:lvlText w:val=""/>
+      <w:lvlJc w:val="left"/>
+      <w:pPr>
+        <w:tabs>
+          <w:tab w:val="num" w:pos="2160"/>
+        </w:tabs>
+        <w:ind w:left="2160" w:hanging="360"/>
+      </w:pPr>
+      <w:rPr>
+        <w:rFonts w:ascii="Wingdings" w:hAnsi="Wingdings" w:hint="default"/>
+        <w:sz w:val="20"/>
+      </w:rPr>
+    </w:lvl>
+    <w:lvl w:ilvl="3" w:tentative="1">
+      <w:start w:val="1"/>
+      <w:numFmt w:val="bullet"/>
+      <w:lvlText w:val=""/>
+      <w:lvlJc w:val="left"/>
+      <w:pPr>
+        <w:tabs>
+          <w:tab w:val="num" w:pos="2880"/>
+        </w:tabs>
+        <w:ind w:left="2880" w:hanging="360"/>
+      </w:pPr>
+      <w:rPr>
+        <w:rFonts w:ascii="Wingdings" w:hAnsi="Wingdings" w:hint="default"/>
+        <w:sz w:val="20"/>
+      </w:rPr>
+    </w:lvl>
+    <w:lvl w:ilvl="4" w:tentative="1">
+      <w:start w:val="1"/>
+      <w:numFmt w:val="bullet"/>
+      <w:lvlText w:val=""/>
+      <w:lvlJc w:val="left"/>
+      <w:pPr>
+        <w:tabs>
+          <w:tab w:val="num" w:pos="3600"/>
+        </w:tabs>
+        <w:ind w:left="3600" w:hanging="360"/>
+      </w:pPr>
+      <w:rPr>
+        <w:rFonts w:ascii="Wingdings" w:hAnsi="Wingdings" w:hint="default"/>
+        <w:sz w:val="20"/>
+      </w:rPr>
+    </w:lvl>
+    <w:lvl w:ilvl="5" w:tentative="1">
+      <w:start w:val="1"/>
+      <w:numFmt w:val="bullet"/>
+      <w:lvlText w:val=""/>
+      <w:lvlJc w:val="left"/>
+      <w:pPr>
+        <w:tabs>
+          <w:tab w:val="num" w:pos="4320"/>
+        </w:tabs>
+        <w:ind w:left="4320" w:hanging="360"/>
+      </w:pPr>
+      <w:rPr>
+        <w:rFonts w:ascii="Wingdings" w:hAnsi="Wingdings" w:hint="default"/>
+        <w:sz w:val="20"/>
+      </w:rPr>
+    </w:lvl>
+    <w:lvl w:ilvl="6" w:tentative="1">
+      <w:start w:val="1"/>
+      <w:numFmt w:val="bullet"/>
+      <w:lvlText w:val=""/>
+      <w:lvlJc w:val="left"/>
+      <w:pPr>
+        <w:tabs>
+          <w:tab w:val="num" w:pos="5040"/>
+        </w:tabs>
+        <w:ind w:left="5040" w:hanging="360"/>
+      </w:pPr>
+      <w:rPr>
+        <w:rFonts w:ascii="Wingdings" w:hAnsi="Wingdings" w:hint="default"/>
+        <w:sz w:val="20"/>
+      </w:rPr>
+    </w:lvl>
+    <w:lvl w:ilvl="7" w:tentative="1">
+      <w:start w:val="1"/>
+      <w:numFmt w:val="bullet"/>
+      <w:lvlText w:val=""/>
+      <w:lvlJc w:val="left"/>
+      <w:pPr>
+        <w:tabs>
+          <w:tab w:val="num" w:pos="5760"/>
+        </w:tabs>
+        <w:ind w:left="5760" w:hanging="360"/>
+      </w:pPr>
+      <w:rPr>
+        <w:rFonts w:ascii="Wingdings" w:hAnsi="Wingdings" w:hint="default"/>
+        <w:sz w:val="20"/>
+      </w:rPr>
+    </w:lvl>
+    <w:lvl w:ilvl="8" w:tentative="1">
+      <w:start w:val="1"/>
+      <w:numFmt w:val="bullet"/>
+      <w:lvlText w:val=""/>
+      <w:lvlJc w:val="left"/>
+      <w:pPr>
+        <w:tabs>
+          <w:tab w:val="num" w:pos="6480"/>
+        </w:tabs>
+        <w:ind w:left="6480" w:hanging="360"/>
+      </w:pPr>
+      <w:rPr>
+        <w:rFonts w:ascii="Wingdings" w:hAnsi="Wingdings" w:hint="default"/>
+        <w:sz w:val="20"/>
+      </w:rPr>
+    </w:lvl>
+  </w:abstractNum>
+  <w:abstractNum w:abstractNumId="6" w15:restartNumberingAfterBreak="0">
     <w:nsid w:val="14BD5084"/>
     <w:multiLevelType w:val="multilevel"/>
     <w:tmpl w:val="18E0B0EA"/>
@@ -17651,7 +19392,7 @@
       </w:rPr>
     </w:lvl>
   </w:abstractNum>
-  <w:abstractNum w:abstractNumId="5" w15:restartNumberingAfterBreak="0">
+  <w:abstractNum w:abstractNumId="7" w15:restartNumberingAfterBreak="0">
     <w:nsid w:val="220F557C"/>
     <w:multiLevelType w:val="multilevel"/>
     <w:tmpl w:val="74AEB668"/>
@@ -17768,7 +19509,7 @@
       </w:pPr>
     </w:lvl>
   </w:abstractNum>
-  <w:abstractNum w:abstractNumId="6" w15:restartNumberingAfterBreak="0">
+  <w:abstractNum w:abstractNumId="8" w15:restartNumberingAfterBreak="0">
     <w:nsid w:val="22903211"/>
     <w:multiLevelType w:val="multilevel"/>
     <w:tmpl w:val="C4884640"/>
@@ -17917,7 +19658,7 @@
       </w:rPr>
     </w:lvl>
   </w:abstractNum>
-  <w:abstractNum w:abstractNumId="7" w15:restartNumberingAfterBreak="0">
+  <w:abstractNum w:abstractNumId="9" w15:restartNumberingAfterBreak="0">
     <w:nsid w:val="290E47D5"/>
     <w:multiLevelType w:val="multilevel"/>
     <w:tmpl w:val="F83CA3AC"/>
@@ -18034,7 +19775,7 @@
       </w:pPr>
     </w:lvl>
   </w:abstractNum>
-  <w:abstractNum w:abstractNumId="8" w15:restartNumberingAfterBreak="0">
+  <w:abstractNum w:abstractNumId="10" w15:restartNumberingAfterBreak="0">
     <w:nsid w:val="2E5D602A"/>
     <w:multiLevelType w:val="multilevel"/>
     <w:tmpl w:val="051E9304"/>
@@ -18179,7 +19920,7 @@
       </w:rPr>
     </w:lvl>
   </w:abstractNum>
-  <w:abstractNum w:abstractNumId="9" w15:restartNumberingAfterBreak="0">
+  <w:abstractNum w:abstractNumId="11" w15:restartNumberingAfterBreak="0">
     <w:nsid w:val="304A3858"/>
     <w:multiLevelType w:val="multilevel"/>
     <w:tmpl w:val="A7C0071A"/>
@@ -18328,7 +20069,7 @@
       </w:rPr>
     </w:lvl>
   </w:abstractNum>
-  <w:abstractNum w:abstractNumId="10" w15:restartNumberingAfterBreak="0">
+  <w:abstractNum w:abstractNumId="12" w15:restartNumberingAfterBreak="0">
     <w:nsid w:val="3E1F7947"/>
     <w:multiLevelType w:val="multilevel"/>
     <w:tmpl w:val="E3362FFC"/>
@@ -18473,7 +20214,156 @@
       </w:rPr>
     </w:lvl>
   </w:abstractNum>
-  <w:abstractNum w:abstractNumId="11" w15:restartNumberingAfterBreak="0">
+  <w:abstractNum w:abstractNumId="13" w15:restartNumberingAfterBreak="0">
+    <w:nsid w:val="4862093D"/>
+    <w:multiLevelType w:val="multilevel"/>
+    <w:tmpl w:val="37CAA3EC"/>
+    <w:lvl w:ilvl="0">
+      <w:start w:val="1"/>
+      <w:numFmt w:val="bullet"/>
+      <w:lvlText w:val=""/>
+      <w:lvlJc w:val="left"/>
+      <w:pPr>
+        <w:tabs>
+          <w:tab w:val="num" w:pos="720"/>
+        </w:tabs>
+        <w:ind w:left="720" w:hanging="360"/>
+      </w:pPr>
+      <w:rPr>
+        <w:rFonts w:ascii="Symbol" w:hAnsi="Symbol" w:hint="default"/>
+        <w:sz w:val="20"/>
+      </w:rPr>
+    </w:lvl>
+    <w:lvl w:ilvl="1" w:tentative="1">
+      <w:start w:val="1"/>
+      <w:numFmt w:val="bullet"/>
+      <w:lvlText w:val="o"/>
+      <w:lvlJc w:val="left"/>
+      <w:pPr>
+        <w:tabs>
+          <w:tab w:val="num" w:pos="1440"/>
+        </w:tabs>
+        <w:ind w:left="1440" w:hanging="360"/>
+      </w:pPr>
+      <w:rPr>
+        <w:rFonts w:ascii="Courier New" w:hAnsi="Courier New" w:hint="default"/>
+        <w:sz w:val="20"/>
+      </w:rPr>
+    </w:lvl>
+    <w:lvl w:ilvl="2" w:tentative="1">
+      <w:start w:val="1"/>
+      <w:numFmt w:val="bullet"/>
+      <w:lvlText w:val=""/>
+      <w:lvlJc w:val="left"/>
+      <w:pPr>
+        <w:tabs>
+          <w:tab w:val="num" w:pos="2160"/>
+        </w:tabs>
+        <w:ind w:left="2160" w:hanging="360"/>
+      </w:pPr>
+      <w:rPr>
+        <w:rFonts w:ascii="Wingdings" w:hAnsi="Wingdings" w:hint="default"/>
+        <w:sz w:val="20"/>
+      </w:rPr>
+    </w:lvl>
+    <w:lvl w:ilvl="3" w:tentative="1">
+      <w:start w:val="1"/>
+      <w:numFmt w:val="bullet"/>
+      <w:lvlText w:val=""/>
+      <w:lvlJc w:val="left"/>
+      <w:pPr>
+        <w:tabs>
+          <w:tab w:val="num" w:pos="2880"/>
+        </w:tabs>
+        <w:ind w:left="2880" w:hanging="360"/>
+      </w:pPr>
+      <w:rPr>
+        <w:rFonts w:ascii="Wingdings" w:hAnsi="Wingdings" w:hint="default"/>
+        <w:sz w:val="20"/>
+      </w:rPr>
+    </w:lvl>
+    <w:lvl w:ilvl="4" w:tentative="1">
+      <w:start w:val="1"/>
+      <w:numFmt w:val="bullet"/>
+      <w:lvlText w:val=""/>
+      <w:lvlJc w:val="left"/>
+      <w:pPr>
+        <w:tabs>
+          <w:tab w:val="num" w:pos="3600"/>
+        </w:tabs>
+        <w:ind w:left="3600" w:hanging="360"/>
+      </w:pPr>
+      <w:rPr>
+        <w:rFonts w:ascii="Wingdings" w:hAnsi="Wingdings" w:hint="default"/>
+        <w:sz w:val="20"/>
+      </w:rPr>
+    </w:lvl>
+    <w:lvl w:ilvl="5" w:tentative="1">
+      <w:start w:val="1"/>
+      <w:numFmt w:val="bullet"/>
+      <w:lvlText w:val=""/>
+      <w:lvlJc w:val="left"/>
+      <w:pPr>
+        <w:tabs>
+          <w:tab w:val="num" w:pos="4320"/>
+        </w:tabs>
+        <w:ind w:left="4320" w:hanging="360"/>
+      </w:pPr>
+      <w:rPr>
+        <w:rFonts w:ascii="Wingdings" w:hAnsi="Wingdings" w:hint="default"/>
+        <w:sz w:val="20"/>
+      </w:rPr>
+    </w:lvl>
+    <w:lvl w:ilvl="6" w:tentative="1">
+      <w:start w:val="1"/>
+      <w:numFmt w:val="bullet"/>
+      <w:lvlText w:val=""/>
+      <w:lvlJc w:val="left"/>
+      <w:pPr>
+        <w:tabs>
+          <w:tab w:val="num" w:pos="5040"/>
+        </w:tabs>
+        <w:ind w:left="5040" w:hanging="360"/>
+      </w:pPr>
+      <w:rPr>
+        <w:rFonts w:ascii="Wingdings" w:hAnsi="Wingdings" w:hint="default"/>
+        <w:sz w:val="20"/>
+      </w:rPr>
+    </w:lvl>
+    <w:lvl w:ilvl="7" w:tentative="1">
+      <w:start w:val="1"/>
+      <w:numFmt w:val="bullet"/>
+      <w:lvlText w:val=""/>
+      <w:lvlJc w:val="left"/>
+      <w:pPr>
+        <w:tabs>
+          <w:tab w:val="num" w:pos="5760"/>
+        </w:tabs>
+        <w:ind w:left="5760" w:hanging="360"/>
+      </w:pPr>
+      <w:rPr>
+        <w:rFonts w:ascii="Wingdings" w:hAnsi="Wingdings" w:hint="default"/>
+        <w:sz w:val="20"/>
+      </w:rPr>
+    </w:lvl>
+    <w:lvl w:ilvl="8" w:tentative="1">
+      <w:start w:val="1"/>
+      <w:numFmt w:val="bullet"/>
+      <w:lvlText w:val=""/>
+      <w:lvlJc w:val="left"/>
+      <w:pPr>
+        <w:tabs>
+          <w:tab w:val="num" w:pos="6480"/>
+        </w:tabs>
+        <w:ind w:left="6480" w:hanging="360"/>
+      </w:pPr>
+      <w:rPr>
+        <w:rFonts w:ascii="Wingdings" w:hAnsi="Wingdings" w:hint="default"/>
+        <w:sz w:val="20"/>
+      </w:rPr>
+    </w:lvl>
+  </w:abstractNum>
+  <w:abstractNum w:abstractNumId="14" w15:restartNumberingAfterBreak="0">
     <w:nsid w:val="48B16291"/>
     <w:multiLevelType w:val="multilevel"/>
     <w:tmpl w:val="4740ECF8"/>
@@ -18618,7 +20508,156 @@
       </w:rPr>
     </w:lvl>
   </w:abstractNum>
-  <w:abstractNum w:abstractNumId="12" w15:restartNumberingAfterBreak="0">
+  <w:abstractNum w:abstractNumId="15" w15:restartNumberingAfterBreak="0">
+    <w:nsid w:val="509108FD"/>
+    <w:multiLevelType w:val="multilevel"/>
+    <w:tmpl w:val="F6826852"/>
+    <w:lvl w:ilvl="0">
+      <w:start w:val="1"/>
+      <w:numFmt w:val="bullet"/>
+      <w:lvlText w:val=""/>
+      <w:lvlJc w:val="left"/>
+      <w:pPr>
+        <w:tabs>
+          <w:tab w:val="num" w:pos="720"/>
+        </w:tabs>
+        <w:ind w:left="720" w:hanging="360"/>
+      </w:pPr>
+      <w:rPr>
+        <w:rFonts w:ascii="Symbol" w:hAnsi="Symbol" w:hint="default"/>
+        <w:sz w:val="20"/>
+      </w:rPr>
+    </w:lvl>
+    <w:lvl w:ilvl="1" w:tentative="1">
+      <w:start w:val="1"/>
+      <w:numFmt w:val="bullet"/>
+      <w:lvlText w:val="o"/>
+      <w:lvlJc w:val="left"/>
+      <w:pPr>
+        <w:tabs>
+          <w:tab w:val="num" w:pos="1440"/>
+        </w:tabs>
+        <w:ind w:left="1440" w:hanging="360"/>
+      </w:pPr>
+      <w:rPr>
+        <w:rFonts w:ascii="Courier New" w:hAnsi="Courier New" w:hint="default"/>
+        <w:sz w:val="20"/>
+      </w:rPr>
+    </w:lvl>
+    <w:lvl w:ilvl="2" w:tentative="1">
+      <w:start w:val="1"/>
+      <w:numFmt w:val="bullet"/>
+      <w:lvlText w:val=""/>
+      <w:lvlJc w:val="left"/>
+      <w:pPr>
+        <w:tabs>
+          <w:tab w:val="num" w:pos="2160"/>
+        </w:tabs>
+        <w:ind w:left="2160" w:hanging="360"/>
+      </w:pPr>
+      <w:rPr>
+        <w:rFonts w:ascii="Wingdings" w:hAnsi="Wingdings" w:hint="default"/>
+        <w:sz w:val="20"/>
+      </w:rPr>
+    </w:lvl>
+    <w:lvl w:ilvl="3" w:tentative="1">
+      <w:start w:val="1"/>
+      <w:numFmt w:val="bullet"/>
+      <w:lvlText w:val=""/>
+      <w:lvlJc w:val="left"/>
+      <w:pPr>
+        <w:tabs>
+          <w:tab w:val="num" w:pos="2880"/>
+        </w:tabs>
+        <w:ind w:left="2880" w:hanging="360"/>
+      </w:pPr>
+      <w:rPr>
+        <w:rFonts w:ascii="Wingdings" w:hAnsi="Wingdings" w:hint="default"/>
+        <w:sz w:val="20"/>
+      </w:rPr>
+    </w:lvl>
+    <w:lvl w:ilvl="4" w:tentative="1">
+      <w:start w:val="1"/>
+      <w:numFmt w:val="bullet"/>
+      <w:lvlText w:val=""/>
+      <w:lvlJc w:val="left"/>
+      <w:pPr>
+        <w:tabs>
+          <w:tab w:val="num" w:pos="3600"/>
+        </w:tabs>
+        <w:ind w:left="3600" w:hanging="360"/>
+      </w:pPr>
+      <w:rPr>
+        <w:rFonts w:ascii="Wingdings" w:hAnsi="Wingdings" w:hint="default"/>
+        <w:sz w:val="20"/>
+      </w:rPr>
+    </w:lvl>
+    <w:lvl w:ilvl="5" w:tentative="1">
+      <w:start w:val="1"/>
+      <w:numFmt w:val="bullet"/>
+      <w:lvlText w:val=""/>
+      <w:lvlJc w:val="left"/>
+      <w:pPr>
+        <w:tabs>
+          <w:tab w:val="num" w:pos="4320"/>
+        </w:tabs>
+        <w:ind w:left="4320" w:hanging="360"/>
+      </w:pPr>
+      <w:rPr>
+        <w:rFonts w:ascii="Wingdings" w:hAnsi="Wingdings" w:hint="default"/>
+        <w:sz w:val="20"/>
+      </w:rPr>
+    </w:lvl>
+    <w:lvl w:ilvl="6" w:tentative="1">
+      <w:start w:val="1"/>
+      <w:numFmt w:val="bullet"/>
+      <w:lvlText w:val=""/>
+      <w:lvlJc w:val="left"/>
+      <w:pPr>
+        <w:tabs>
+          <w:tab w:val="num" w:pos="5040"/>
+        </w:tabs>
+        <w:ind w:left="5040" w:hanging="360"/>
+      </w:pPr>
+      <w:rPr>
+        <w:rFonts w:ascii="Wingdings" w:hAnsi="Wingdings" w:hint="default"/>
+        <w:sz w:val="20"/>
+      </w:rPr>
+    </w:lvl>
+    <w:lvl w:ilvl="7" w:tentative="1">
+      <w:start w:val="1"/>
+      <w:numFmt w:val="bullet"/>
+      <w:lvlText w:val=""/>
+      <w:lvlJc w:val="left"/>
+      <w:pPr>
+        <w:tabs>
+          <w:tab w:val="num" w:pos="5760"/>
+        </w:tabs>
+        <w:ind w:left="5760" w:hanging="360"/>
+      </w:pPr>
+      <w:rPr>
+        <w:rFonts w:ascii="Wingdings" w:hAnsi="Wingdings" w:hint="default"/>
+        <w:sz w:val="20"/>
+      </w:rPr>
+    </w:lvl>
+    <w:lvl w:ilvl="8" w:tentative="1">
+      <w:start w:val="1"/>
+      <w:numFmt w:val="bullet"/>
+      <w:lvlText w:val=""/>
+      <w:lvlJc w:val="left"/>
+      <w:pPr>
+        <w:tabs>
+          <w:tab w:val="num" w:pos="6480"/>
+        </w:tabs>
+        <w:ind w:left="6480" w:hanging="360"/>
+      </w:pPr>
+      <w:rPr>
+        <w:rFonts w:ascii="Wingdings" w:hAnsi="Wingdings" w:hint="default"/>
+        <w:sz w:val="20"/>
+      </w:rPr>
+    </w:lvl>
+  </w:abstractNum>
+  <w:abstractNum w:abstractNumId="16" w15:restartNumberingAfterBreak="0">
     <w:nsid w:val="51A43FC2"/>
     <w:multiLevelType w:val="multilevel"/>
     <w:tmpl w:val="5E44D9E8"/>
@@ -18767,7 +20806,7 @@
       </w:rPr>
     </w:lvl>
   </w:abstractNum>
-  <w:abstractNum w:abstractNumId="13" w15:restartNumberingAfterBreak="0">
+  <w:abstractNum w:abstractNumId="17" w15:restartNumberingAfterBreak="0">
     <w:nsid w:val="52E149C8"/>
     <w:multiLevelType w:val="multilevel"/>
     <w:tmpl w:val="744E4198"/>
@@ -18884,7 +20923,156 @@
       </w:pPr>
     </w:lvl>
   </w:abstractNum>
-  <w:abstractNum w:abstractNumId="14" w15:restartNumberingAfterBreak="0">
+  <w:abstractNum w:abstractNumId="18" w15:restartNumberingAfterBreak="0">
+    <w:nsid w:val="582E3407"/>
+    <w:multiLevelType w:val="multilevel"/>
+    <w:tmpl w:val="3E5CB1B2"/>
+    <w:lvl w:ilvl="0">
+      <w:start w:val="1"/>
+      <w:numFmt w:val="bullet"/>
+      <w:lvlText w:val=""/>
+      <w:lvlJc w:val="left"/>
+      <w:pPr>
+        <w:tabs>
+          <w:tab w:val="num" w:pos="720"/>
+        </w:tabs>
+        <w:ind w:left="720" w:hanging="360"/>
+      </w:pPr>
+      <w:rPr>
+        <w:rFonts w:ascii="Symbol" w:hAnsi="Symbol" w:hint="default"/>
+        <w:sz w:val="20"/>
+      </w:rPr>
+    </w:lvl>
+    <w:lvl w:ilvl="1" w:tentative="1">
+      <w:start w:val="1"/>
+      <w:numFmt w:val="bullet"/>
+      <w:lvlText w:val="o"/>
+      <w:lvlJc w:val="left"/>
+      <w:pPr>
+        <w:tabs>
+          <w:tab w:val="num" w:pos="1440"/>
+        </w:tabs>
+        <w:ind w:left="1440" w:hanging="360"/>
+      </w:pPr>
+      <w:rPr>
+        <w:rFonts w:ascii="Courier New" w:hAnsi="Courier New" w:hint="default"/>
+        <w:sz w:val="20"/>
+      </w:rPr>
+    </w:lvl>
+    <w:lvl w:ilvl="2" w:tentative="1">
+      <w:start w:val="1"/>
+      <w:numFmt w:val="bullet"/>
+      <w:lvlText w:val=""/>
+      <w:lvlJc w:val="left"/>
+      <w:pPr>
+        <w:tabs>
+          <w:tab w:val="num" w:pos="2160"/>
+        </w:tabs>
+        <w:ind w:left="2160" w:hanging="360"/>
+      </w:pPr>
+      <w:rPr>
+        <w:rFonts w:ascii="Wingdings" w:hAnsi="Wingdings" w:hint="default"/>
+        <w:sz w:val="20"/>
+      </w:rPr>
+    </w:lvl>
+    <w:lvl w:ilvl="3" w:tentative="1">
+      <w:start w:val="1"/>
+      <w:numFmt w:val="bullet"/>
+      <w:lvlText w:val=""/>
+      <w:lvlJc w:val="left"/>
+      <w:pPr>
+        <w:tabs>
+          <w:tab w:val="num" w:pos="2880"/>
+        </w:tabs>
+        <w:ind w:left="2880" w:hanging="360"/>
+      </w:pPr>
+      <w:rPr>
+        <w:rFonts w:ascii="Wingdings" w:hAnsi="Wingdings" w:hint="default"/>
+        <w:sz w:val="20"/>
+      </w:rPr>
+    </w:lvl>
+    <w:lvl w:ilvl="4" w:tentative="1">
+      <w:start w:val="1"/>
+      <w:numFmt w:val="bullet"/>
+      <w:lvlText w:val=""/>
+      <w:lvlJc w:val="left"/>
+      <w:pPr>
+        <w:tabs>
+          <w:tab w:val="num" w:pos="3600"/>
+        </w:tabs>
+        <w:ind w:left="3600" w:hanging="360"/>
+      </w:pPr>
+      <w:rPr>
+        <w:rFonts w:ascii="Wingdings" w:hAnsi="Wingdings" w:hint="default"/>
+        <w:sz w:val="20"/>
+      </w:rPr>
+    </w:lvl>
+    <w:lvl w:ilvl="5" w:tentative="1">
+      <w:start w:val="1"/>
+      <w:numFmt w:val="bullet"/>
+      <w:lvlText w:val=""/>
+      <w:lvlJc w:val="left"/>
+      <w:pPr>
+        <w:tabs>
+          <w:tab w:val="num" w:pos="4320"/>
+        </w:tabs>
+        <w:ind w:left="4320" w:hanging="360"/>
+      </w:pPr>
+      <w:rPr>
+        <w:rFonts w:ascii="Wingdings" w:hAnsi="Wingdings" w:hint="default"/>
+        <w:sz w:val="20"/>
+      </w:rPr>
+    </w:lvl>
+    <w:lvl w:ilvl="6" w:tentative="1">
+      <w:start w:val="1"/>
+      <w:numFmt w:val="bullet"/>
+      <w:lvlText w:val=""/>
+      <w:lvlJc w:val="left"/>
+      <w:pPr>
+        <w:tabs>
+          <w:tab w:val="num" w:pos="5040"/>
+        </w:tabs>
+        <w:ind w:left="5040" w:hanging="360"/>
+      </w:pPr>
+      <w:rPr>
+        <w:rFonts w:ascii="Wingdings" w:hAnsi="Wingdings" w:hint="default"/>
+        <w:sz w:val="20"/>
+      </w:rPr>
+    </w:lvl>
+    <w:lvl w:ilvl="7" w:tentative="1">
+      <w:start w:val="1"/>
+      <w:numFmt w:val="bullet"/>
+      <w:lvlText w:val=""/>
+      <w:lvlJc w:val="left"/>
+      <w:pPr>
+        <w:tabs>
+          <w:tab w:val="num" w:pos="5760"/>
+        </w:tabs>
+        <w:ind w:left="5760" w:hanging="360"/>
+      </w:pPr>
+      <w:rPr>
+        <w:rFonts w:ascii="Wingdings" w:hAnsi="Wingdings" w:hint="default"/>
+        <w:sz w:val="20"/>
+      </w:rPr>
+    </w:lvl>
+    <w:lvl w:ilvl="8" w:tentative="1">
+      <w:start w:val="1"/>
+      <w:numFmt w:val="bullet"/>
+      <w:lvlText w:val=""/>
+      <w:lvlJc w:val="left"/>
+      <w:pPr>
+        <w:tabs>
+          <w:tab w:val="num" w:pos="6480"/>
+        </w:tabs>
+        <w:ind w:left="6480" w:hanging="360"/>
+      </w:pPr>
+      <w:rPr>
+        <w:rFonts w:ascii="Wingdings" w:hAnsi="Wingdings" w:hint="default"/>
+        <w:sz w:val="20"/>
+      </w:rPr>
+    </w:lvl>
+  </w:abstractNum>
+  <w:abstractNum w:abstractNumId="19" w15:restartNumberingAfterBreak="0">
     <w:nsid w:val="58656F2B"/>
     <w:multiLevelType w:val="multilevel"/>
     <w:tmpl w:val="1280F8F4"/>
@@ -19029,7 +21217,7 @@
       </w:rPr>
     </w:lvl>
   </w:abstractNum>
-  <w:abstractNum w:abstractNumId="15" w15:restartNumberingAfterBreak="0">
+  <w:abstractNum w:abstractNumId="20" w15:restartNumberingAfterBreak="0">
     <w:nsid w:val="5B1625A3"/>
     <w:multiLevelType w:val="multilevel"/>
     <w:tmpl w:val="54B0409C"/>
@@ -19178,7 +21366,7 @@
       </w:rPr>
     </w:lvl>
   </w:abstractNum>
-  <w:abstractNum w:abstractNumId="16" w15:restartNumberingAfterBreak="0">
+  <w:abstractNum w:abstractNumId="21" w15:restartNumberingAfterBreak="0">
     <w:nsid w:val="5CDA4F47"/>
     <w:multiLevelType w:val="multilevel"/>
     <w:tmpl w:val="2AE4D5DA"/>
@@ -19295,7 +21483,7 @@
       </w:pPr>
     </w:lvl>
   </w:abstractNum>
-  <w:abstractNum w:abstractNumId="17" w15:restartNumberingAfterBreak="0">
+  <w:abstractNum w:abstractNumId="22" w15:restartNumberingAfterBreak="0">
     <w:nsid w:val="5F574A47"/>
     <w:multiLevelType w:val="multilevel"/>
     <w:tmpl w:val="A40A7BE4"/>
@@ -19444,7 +21632,7 @@
       </w:rPr>
     </w:lvl>
   </w:abstractNum>
-  <w:abstractNum w:abstractNumId="18" w15:restartNumberingAfterBreak="0">
+  <w:abstractNum w:abstractNumId="23" w15:restartNumberingAfterBreak="0">
     <w:nsid w:val="663F5A64"/>
     <w:multiLevelType w:val="multilevel"/>
     <w:tmpl w:val="DD3CF118"/>
@@ -19561,7 +21749,7 @@
       </w:pPr>
     </w:lvl>
   </w:abstractNum>
-  <w:abstractNum w:abstractNumId="19" w15:restartNumberingAfterBreak="0">
+  <w:abstractNum w:abstractNumId="24" w15:restartNumberingAfterBreak="0">
     <w:nsid w:val="681D5F99"/>
     <w:multiLevelType w:val="multilevel"/>
     <w:tmpl w:val="8E0867BE"/>
@@ -19710,7 +21898,7 @@
       </w:rPr>
     </w:lvl>
   </w:abstractNum>
-  <w:abstractNum w:abstractNumId="20" w15:restartNumberingAfterBreak="0">
+  <w:abstractNum w:abstractNumId="25" w15:restartNumberingAfterBreak="0">
     <w:nsid w:val="714415F7"/>
     <w:multiLevelType w:val="multilevel"/>
     <w:tmpl w:val="931E81C4"/>
@@ -19823,7 +22011,7 @@
       </w:pPr>
     </w:lvl>
   </w:abstractNum>
-  <w:abstractNum w:abstractNumId="21" w15:restartNumberingAfterBreak="0">
+  <w:abstractNum w:abstractNumId="26" w15:restartNumberingAfterBreak="0">
     <w:nsid w:val="76A32368"/>
     <w:multiLevelType w:val="multilevel"/>
     <w:tmpl w:val="23DAC3B4"/>
@@ -19968,7 +22156,7 @@
       </w:rPr>
     </w:lvl>
   </w:abstractNum>
-  <w:abstractNum w:abstractNumId="22" w15:restartNumberingAfterBreak="0">
+  <w:abstractNum w:abstractNumId="27" w15:restartNumberingAfterBreak="0">
     <w:nsid w:val="7A5431A0"/>
     <w:multiLevelType w:val="multilevel"/>
     <w:tmpl w:val="2048F370"/>
@@ -20086,73 +22274,88 @@
     </w:lvl>
   </w:abstractNum>
   <w:num w:numId="1" w16cid:durableId="480539678">
-    <w:abstractNumId w:val="5"/>
+    <w:abstractNumId w:val="7"/>
   </w:num>
   <w:num w:numId="2" w16cid:durableId="1549295392">
-    <w:abstractNumId w:val="18"/>
+    <w:abstractNumId w:val="23"/>
   </w:num>
   <w:num w:numId="3" w16cid:durableId="1453669364">
-    <w:abstractNumId w:val="7"/>
+    <w:abstractNumId w:val="9"/>
   </w:num>
   <w:num w:numId="4" w16cid:durableId="2034648602">
-    <w:abstractNumId w:val="13"/>
+    <w:abstractNumId w:val="17"/>
   </w:num>
   <w:num w:numId="5" w16cid:durableId="937642905">
-    <w:abstractNumId w:val="2"/>
+    <w:abstractNumId w:val="3"/>
   </w:num>
   <w:num w:numId="6" w16cid:durableId="1360736285">
-    <w:abstractNumId w:val="22"/>
+    <w:abstractNumId w:val="27"/>
   </w:num>
   <w:num w:numId="7" w16cid:durableId="1234314148">
     <w:abstractNumId w:val="0"/>
   </w:num>
   <w:num w:numId="8" w16cid:durableId="74785251">
+    <w:abstractNumId w:val="2"/>
+  </w:num>
+  <w:num w:numId="9" w16cid:durableId="1703555296">
+    <w:abstractNumId w:val="25"/>
+  </w:num>
+  <w:num w:numId="10" w16cid:durableId="1134906380">
+    <w:abstractNumId w:val="6"/>
+  </w:num>
+  <w:num w:numId="11" w16cid:durableId="259412349">
+    <w:abstractNumId w:val="12"/>
+  </w:num>
+  <w:num w:numId="12" w16cid:durableId="897983578">
+    <w:abstractNumId w:val="26"/>
+  </w:num>
+  <w:num w:numId="13" w16cid:durableId="1128160474">
+    <w:abstractNumId w:val="14"/>
+  </w:num>
+  <w:num w:numId="14" w16cid:durableId="854149088">
+    <w:abstractNumId w:val="19"/>
+  </w:num>
+  <w:num w:numId="15" w16cid:durableId="1406489176">
+    <w:abstractNumId w:val="4"/>
+  </w:num>
+  <w:num w:numId="16" w16cid:durableId="1064643590">
+    <w:abstractNumId w:val="10"/>
+  </w:num>
+  <w:num w:numId="17" w16cid:durableId="1019232028">
+    <w:abstractNumId w:val="8"/>
+  </w:num>
+  <w:num w:numId="18" w16cid:durableId="769857890">
+    <w:abstractNumId w:val="16"/>
+  </w:num>
+  <w:num w:numId="19" w16cid:durableId="973099603">
+    <w:abstractNumId w:val="22"/>
+  </w:num>
+  <w:num w:numId="20" w16cid:durableId="975914397">
+    <w:abstractNumId w:val="24"/>
+  </w:num>
+  <w:num w:numId="21" w16cid:durableId="355621761">
+    <w:abstractNumId w:val="20"/>
+  </w:num>
+  <w:num w:numId="22" w16cid:durableId="1670059583">
+    <w:abstractNumId w:val="11"/>
+  </w:num>
+  <w:num w:numId="23" w16cid:durableId="1599286283">
+    <w:abstractNumId w:val="21"/>
+  </w:num>
+  <w:num w:numId="24" w16cid:durableId="1235697766">
+    <w:abstractNumId w:val="5"/>
+  </w:num>
+  <w:num w:numId="25" w16cid:durableId="969214002">
+    <w:abstractNumId w:val="15"/>
+  </w:num>
+  <w:num w:numId="26" w16cid:durableId="732702974">
     <w:abstractNumId w:val="1"/>
   </w:num>
-  <w:num w:numId="9" w16cid:durableId="1703555296">
-    <w:abstractNumId w:val="20"/>
+  <w:num w:numId="27" w16cid:durableId="1432627951">
+    <w:abstractNumId w:val="18"/>
   </w:num>
-  <w:num w:numId="10" w16cid:durableId="1134906380">
-    <w:abstractNumId w:val="4"/>
-  </w:num>
-  <w:num w:numId="11" w16cid:durableId="259412349">
-    <w:abstractNumId w:val="10"/>
-  </w:num>
-  <w:num w:numId="12" w16cid:durableId="897983578">
-    <w:abstractNumId w:val="21"/>
-  </w:num>
-  <w:num w:numId="13" w16cid:durableId="1128160474">
-    <w:abstractNumId w:val="11"/>
-  </w:num>
-  <w:num w:numId="14" w16cid:durableId="854149088">
-    <w:abstractNumId w:val="14"/>
-  </w:num>
-  <w:num w:numId="15" w16cid:durableId="1406489176">
-    <w:abstractNumId w:val="3"/>
-  </w:num>
-  <w:num w:numId="16" w16cid:durableId="1064643590">
-    <w:abstractNumId w:val="8"/>
-  </w:num>
-  <w:num w:numId="17" w16cid:durableId="1019232028">
-    <w:abstractNumId w:val="6"/>
-  </w:num>
-  <w:num w:numId="18" w16cid:durableId="769857890">
-    <w:abstractNumId w:val="12"/>
-  </w:num>
-  <w:num w:numId="19" w16cid:durableId="973099603">
-    <w:abstractNumId w:val="17"/>
-  </w:num>
-  <w:num w:numId="20" w16cid:durableId="975914397">
-    <w:abstractNumId w:val="19"/>
-  </w:num>
-  <w:num w:numId="21" w16cid:durableId="355621761">
-    <w:abstractNumId w:val="15"/>
-  </w:num>
-  <w:num w:numId="22" w16cid:durableId="1670059583">
-    <w:abstractNumId w:val="9"/>
-  </w:num>
-  <w:num w:numId="23" w16cid:durableId="1599286283">
-    <w:abstractNumId w:val="16"/>
+  <w:num w:numId="28" w16cid:durableId="362364665">
+    <w:abstractNumId w:val="13"/>
   </w:num>
 </w:numbering>
 </file>

</xml_diff>